<commit_message>
CA: iteration4 acceptance tests written
</commit_message>
<xml_diff>
--- a/BlastImplementation/documentation/Use case diagram/UserStories_15042026.docx
+++ b/BlastImplementation/documentation/Use case diagram/UserStories_15042026.docx
@@ -158,7 +158,15 @@
         </w:numPr>
       </w:pPr>
       <w:r>
-        <w:t>find all K-mers of a given length in a given DNA or protein sequence</w:t>
+        <w:t>find all K-</w:t>
+      </w:r>
+      <w:proofErr w:type="spellStart"/>
+      <w:r>
+        <w:t>mers</w:t>
+      </w:r>
+      <w:proofErr w:type="spellEnd"/>
+      <w:r>
+        <w:t xml:space="preserve"> of a given length in a given DNA or protein sequence</w:t>
       </w:r>
     </w:p>
     <w:p>
@@ -228,7 +236,31 @@
         <w:t xml:space="preserve">When the query FASTA file is uploaded, the user wants to see the name of the file on the BLASTP window next to the upload button as a means of confirmation that the upload was successful. </w:t>
       </w:r>
       <w:r>
-        <w:t xml:space="preserve">The user wants the option to specify some common BLASTP parameters in a drop down menu. Specifically, it wants to adjust the e-value threshold, the maximum number of output sequences (in case of many hits), and the scoring matrix that is used in the BLAST algorithm. The user wants to perform BLASTP using the default Uniprot database. Moreover, if possible, the user would also like to provide its own database in FASTA format. When the user provides its own database, the provided database needs to be used instead of the default Uniprot database. When the user presses the BLAST button, the BLASTP should be performed and the results should be stored in the downloads folder of the user and also be shown in a new output window. The output window needs to be the same for the default Uniprot database and the custom database. In a later stage, the user would also like to select what parts of the BLASTP output to see </w:t>
+        <w:t xml:space="preserve">The user wants the option to specify some common BLASTP parameters in a drop down menu. Specifically, it wants to adjust the e-value threshold, the maximum number of output sequences (in case of many hits), and the scoring matrix that is used in the BLAST algorithm. The user wants to perform BLASTP using the default </w:t>
+      </w:r>
+      <w:proofErr w:type="spellStart"/>
+      <w:r>
+        <w:t>Uniprot</w:t>
+      </w:r>
+      <w:proofErr w:type="spellEnd"/>
+      <w:r>
+        <w:t xml:space="preserve"> database. Moreover, if possible, the user would also like to provide its own database in FASTA format. When the user provides its own database, the provided database needs to be used instead of the default </w:t>
+      </w:r>
+      <w:proofErr w:type="spellStart"/>
+      <w:r>
+        <w:t>Uniprot</w:t>
+      </w:r>
+      <w:proofErr w:type="spellEnd"/>
+      <w:r>
+        <w:t xml:space="preserve"> database. When the user presses the BLAST button, the BLASTP should be performed and the results should be stored in the downloads folder of the user and also be shown in a new output window. The output window needs to be the same for the default </w:t>
+      </w:r>
+      <w:proofErr w:type="spellStart"/>
+      <w:r>
+        <w:t>Uniprot</w:t>
+      </w:r>
+      <w:proofErr w:type="spellEnd"/>
+      <w:r>
+        <w:t xml:space="preserve"> database and the custom database. In a later stage, the user would also like to select what parts of the BLASTP output to see </w:t>
       </w:r>
       <w:r>
         <w:t>in the output window.</w:t>
@@ -237,7 +269,11 @@
     <w:p/>
     <w:p>
       <w:r>
-        <w:t>In case the user presses the BLASTP button without having provided either a protein in FASTA file format in the text box or having uploaded a query FASTA file, an error message should appear prompting the user to either enter a protein</w:t>
+        <w:t xml:space="preserve">In case the user presses the BLASTP button without having provided either a protein in FASTA file format in the text box or having uploaded a query FASTA file, an error message </w:t>
+      </w:r>
+      <w:r>
+        <w:lastRenderedPageBreak/>
+        <w:t>should appear prompting the user to either enter a protein</w:t>
       </w:r>
       <w:r>
         <w:t xml:space="preserve"> sequence</w:t>
@@ -267,6 +303,7 @@
           <w:sz w:val="36"/>
           <w:szCs w:val="36"/>
         </w:rPr>
+        <w:lastRenderedPageBreak/>
         <w:t xml:space="preserve">Iteration </w:t>
       </w:r>
       <w:r>
@@ -302,14 +339,8 @@
     <w:p>
       <w:pPr>
         <w:pStyle w:val="Heading3"/>
-        <w:rPr>
-          <w:highlight w:val="yellow"/>
-        </w:rPr>
-      </w:pPr>
-      <w:r>
-        <w:rPr>
-          <w:highlight w:val="yellow"/>
-        </w:rPr>
+      </w:pPr>
+      <w:r>
         <w:t>BLASTN</w:t>
       </w:r>
     </w:p>
@@ -328,193 +359,123 @@
             <w:tcW w:w="8299" w:type="dxa"/>
           </w:tcPr>
           <w:p>
+            <w:r>
+              <w:rPr>
+                <w:b/>
+                <w:bCs/>
+              </w:rPr>
+              <w:t>As</w:t>
+            </w:r>
+            <w:r>
+              <w:t xml:space="preserve"> a life science scientist</w:t>
+            </w:r>
+          </w:p>
+        </w:tc>
+      </w:tr>
+      <w:tr>
+        <w:tc>
+          <w:tcPr>
+            <w:tcW w:w="8299" w:type="dxa"/>
+          </w:tcPr>
+          <w:p>
+            <w:r>
+              <w:rPr>
+                <w:b/>
+                <w:bCs/>
+              </w:rPr>
+              <w:t>I want</w:t>
+            </w:r>
+            <w:r>
+              <w:t xml:space="preserve"> </w:t>
+            </w:r>
+            <w:r>
+              <w:t>perform BLASTN on my nucleotide sequence</w:t>
+            </w:r>
+          </w:p>
+        </w:tc>
+      </w:tr>
+      <w:tr>
+        <w:tc>
+          <w:tcPr>
+            <w:tcW w:w="8299" w:type="dxa"/>
+          </w:tcPr>
+          <w:p>
+            <w:r>
+              <w:rPr>
+                <w:b/>
+                <w:bCs/>
+              </w:rPr>
+              <w:t>So that</w:t>
+            </w:r>
+            <w:r>
+              <w:t xml:space="preserve"> I can analyze</w:t>
+            </w:r>
+            <w:r>
+              <w:t xml:space="preserve"> my sequence</w:t>
+            </w:r>
+          </w:p>
+        </w:tc>
+      </w:tr>
+      <w:tr>
+        <w:tc>
+          <w:tcPr>
+            <w:tcW w:w="8299" w:type="dxa"/>
+          </w:tcPr>
+          <w:p>
+            <w:r>
+              <w:rPr>
+                <w:b/>
+                <w:bCs/>
+              </w:rPr>
+              <w:t>Acceptance criteria</w:t>
+            </w:r>
+            <w:r>
+              <w:t>:</w:t>
+            </w:r>
+          </w:p>
+          <w:p>
+            <w:r>
+              <w:t>Create output</w:t>
+            </w:r>
+            <w:r>
+              <w:t xml:space="preserve"> fitting BLASTN</w:t>
+            </w:r>
+            <w:r>
+              <w:t xml:space="preserve"> after giving a nucleotide sequence </w:t>
+            </w:r>
+          </w:p>
+        </w:tc>
+      </w:tr>
+      <w:tr>
+        <w:tc>
+          <w:tcPr>
+            <w:tcW w:w="8299" w:type="dxa"/>
+          </w:tcPr>
+          <w:p>
             <w:pPr>
               <w:rPr>
-                <w:highlight w:val="yellow"/>
+                <w:b/>
+                <w:bCs/>
               </w:rPr>
             </w:pPr>
             <w:r>
               <w:rPr>
                 <w:b/>
                 <w:bCs/>
-                <w:highlight w:val="yellow"/>
-              </w:rPr>
-              <w:t>As</w:t>
-            </w:r>
-            <w:r>
-              <w:rPr>
-                <w:highlight w:val="yellow"/>
-              </w:rPr>
-              <w:t xml:space="preserve"> a life science scientist</w:t>
-            </w:r>
-          </w:p>
-        </w:tc>
-      </w:tr>
-      <w:tr>
-        <w:tc>
-          <w:tcPr>
-            <w:tcW w:w="8299" w:type="dxa"/>
-          </w:tcPr>
-          <w:p>
-            <w:pPr>
-              <w:rPr>
-                <w:highlight w:val="yellow"/>
-              </w:rPr>
-            </w:pPr>
-            <w:r>
-              <w:rPr>
-                <w:b/>
-                <w:bCs/>
-                <w:highlight w:val="yellow"/>
-              </w:rPr>
-              <w:t>I want</w:t>
-            </w:r>
-            <w:r>
-              <w:rPr>
-                <w:highlight w:val="yellow"/>
-              </w:rPr>
+              </w:rPr>
+              <w:t>Acceptance test:</w:t>
+            </w:r>
+          </w:p>
+          <w:p>
+            <w:r>
+              <w:t xml:space="preserve">In BLAST output GUI, </w:t>
+            </w:r>
+            <w:r>
+              <w:t>the output should be visualized neatly</w:t>
+            </w:r>
+            <w:r>
               <w:t xml:space="preserve"> </w:t>
             </w:r>
-            <w:r>
-              <w:rPr>
-                <w:highlight w:val="yellow"/>
-              </w:rPr>
-              <w:t>perform BLASTN on my nucleotide sequence</w:t>
-            </w:r>
-          </w:p>
-        </w:tc>
-      </w:tr>
-      <w:tr>
-        <w:tc>
-          <w:tcPr>
-            <w:tcW w:w="8299" w:type="dxa"/>
-          </w:tcPr>
-          <w:p>
-            <w:pPr>
-              <w:rPr>
-                <w:highlight w:val="yellow"/>
-              </w:rPr>
-            </w:pPr>
-            <w:r>
-              <w:rPr>
-                <w:b/>
-                <w:bCs/>
-                <w:highlight w:val="yellow"/>
-              </w:rPr>
-              <w:t>So that</w:t>
-            </w:r>
-            <w:r>
-              <w:rPr>
-                <w:highlight w:val="yellow"/>
-              </w:rPr>
-              <w:t xml:space="preserve"> I can analyze</w:t>
-            </w:r>
-            <w:r>
-              <w:rPr>
-                <w:highlight w:val="yellow"/>
-              </w:rPr>
-              <w:t xml:space="preserve"> my sequence</w:t>
-            </w:r>
-          </w:p>
-        </w:tc>
-      </w:tr>
-      <w:tr>
-        <w:tc>
-          <w:tcPr>
-            <w:tcW w:w="8299" w:type="dxa"/>
-          </w:tcPr>
-          <w:p>
-            <w:pPr>
-              <w:rPr>
-                <w:highlight w:val="yellow"/>
-              </w:rPr>
-            </w:pPr>
-            <w:r>
-              <w:rPr>
-                <w:b/>
-                <w:bCs/>
-                <w:highlight w:val="yellow"/>
-              </w:rPr>
-              <w:t>Acceptance criteria</w:t>
-            </w:r>
-            <w:r>
-              <w:rPr>
-                <w:highlight w:val="yellow"/>
-              </w:rPr>
-              <w:t>:</w:t>
-            </w:r>
-          </w:p>
-          <w:p>
-            <w:pPr>
-              <w:rPr>
-                <w:highlight w:val="yellow"/>
-              </w:rPr>
-            </w:pPr>
-            <w:r>
-              <w:rPr>
-                <w:highlight w:val="yellow"/>
-              </w:rPr>
-              <w:t>Create output</w:t>
-            </w:r>
-            <w:r>
-              <w:rPr>
-                <w:highlight w:val="yellow"/>
-              </w:rPr>
-              <w:t xml:space="preserve"> fitting BLASTN</w:t>
-            </w:r>
-            <w:r>
-              <w:rPr>
-                <w:highlight w:val="yellow"/>
-              </w:rPr>
-              <w:t xml:space="preserve"> after giving a nucleotide sequence </w:t>
-            </w:r>
-          </w:p>
-        </w:tc>
-      </w:tr>
-      <w:tr>
-        <w:tc>
-          <w:tcPr>
-            <w:tcW w:w="8299" w:type="dxa"/>
-          </w:tcPr>
-          <w:p>
-            <w:pPr>
-              <w:rPr>
-                <w:b/>
-                <w:bCs/>
-                <w:highlight w:val="yellow"/>
-              </w:rPr>
-            </w:pPr>
-            <w:r>
-              <w:rPr>
-                <w:b/>
-                <w:bCs/>
-                <w:highlight w:val="yellow"/>
-              </w:rPr>
-              <w:t>Acceptance test:</w:t>
-            </w:r>
-          </w:p>
-          <w:p>
-            <w:r>
-              <w:rPr>
-                <w:highlight w:val="yellow"/>
-              </w:rPr>
-              <w:t>In BLAST output GUI</w:t>
-            </w:r>
-            <w:r>
-              <w:rPr>
-                <w:highlight w:val="yellow"/>
-              </w:rPr>
-              <w:t xml:space="preserve">, </w:t>
-            </w:r>
-            <w:r>
-              <w:rPr>
-                <w:highlight w:val="yellow"/>
-              </w:rPr>
-              <w:t>the output should be visualized neatly</w:t>
-            </w:r>
-            <w:r>
-              <w:t xml:space="preserve"> </w:t>
-            </w:r>
           </w:p>
         </w:tc>
       </w:tr>
@@ -522,14 +483,8 @@
     <w:p>
       <w:pPr>
         <w:pStyle w:val="Heading3"/>
-        <w:rPr>
-          <w:highlight w:val="yellow"/>
-        </w:rPr>
-      </w:pPr>
-      <w:r>
-        <w:rPr>
-          <w:highlight w:val="yellow"/>
-        </w:rPr>
+      </w:pPr>
+      <w:r>
         <w:t>Clear button BLAST</w:t>
       </w:r>
     </w:p>
@@ -548,23 +503,14 @@
             <w:tcW w:w="8299" w:type="dxa"/>
           </w:tcPr>
           <w:p>
-            <w:pPr>
-              <w:rPr>
-                <w:highlight w:val="yellow"/>
-              </w:rPr>
-            </w:pPr>
-            <w:r>
-              <w:rPr>
-                <w:b/>
-                <w:bCs/>
-                <w:highlight w:val="yellow"/>
+            <w:r>
+              <w:rPr>
+                <w:b/>
+                <w:bCs/>
               </w:rPr>
               <w:t xml:space="preserve">As a </w:t>
             </w:r>
             <w:r>
-              <w:rPr>
-                <w:highlight w:val="yellow"/>
-              </w:rPr>
               <w:t>life science scientist</w:t>
             </w:r>
           </w:p>
@@ -576,29 +522,17 @@
             <w:tcW w:w="8299" w:type="dxa"/>
           </w:tcPr>
           <w:p>
-            <w:pPr>
-              <w:rPr>
-                <w:highlight w:val="yellow"/>
-              </w:rPr>
-            </w:pPr>
-            <w:r>
-              <w:rPr>
-                <w:b/>
-                <w:bCs/>
-                <w:highlight w:val="yellow"/>
+            <w:r>
+              <w:rPr>
+                <w:b/>
+                <w:bCs/>
               </w:rPr>
               <w:t xml:space="preserve">I want to </w:t>
             </w:r>
             <w:r>
-              <w:rPr>
-                <w:highlight w:val="yellow"/>
-              </w:rPr>
               <w:t>remove my initial file input or text area input</w:t>
             </w:r>
             <w:r>
-              <w:rPr>
-                <w:highlight w:val="yellow"/>
-              </w:rPr>
               <w:t xml:space="preserve"> and use the other option.</w:t>
             </w:r>
           </w:p>
@@ -610,41 +544,23 @@
             <w:tcW w:w="8299" w:type="dxa"/>
           </w:tcPr>
           <w:p>
-            <w:pPr>
-              <w:rPr>
-                <w:highlight w:val="yellow"/>
-              </w:rPr>
-            </w:pPr>
-            <w:r>
-              <w:rPr>
-                <w:b/>
-                <w:bCs/>
-                <w:highlight w:val="yellow"/>
+            <w:r>
+              <w:rPr>
+                <w:b/>
+                <w:bCs/>
               </w:rPr>
               <w:t>So that</w:t>
             </w:r>
             <w:r>
-              <w:rPr>
-                <w:highlight w:val="yellow"/>
-              </w:rPr>
               <w:t xml:space="preserve"> I can </w:t>
             </w:r>
             <w:r>
-              <w:rPr>
-                <w:highlight w:val="yellow"/>
-              </w:rPr>
               <w:t xml:space="preserve">change my mind </w:t>
             </w:r>
             <w:r>
-              <w:rPr>
-                <w:highlight w:val="yellow"/>
-              </w:rPr>
               <w:t xml:space="preserve">or </w:t>
             </w:r>
             <w:r>
-              <w:rPr>
-                <w:highlight w:val="yellow"/>
-              </w:rPr>
               <w:t xml:space="preserve">try again after messing up the file upload. </w:t>
             </w:r>
           </w:p>
@@ -656,31 +572,19 @@
             <w:tcW w:w="8299" w:type="dxa"/>
           </w:tcPr>
           <w:p>
-            <w:pPr>
-              <w:rPr>
-                <w:highlight w:val="yellow"/>
-              </w:rPr>
-            </w:pPr>
-            <w:r>
-              <w:rPr>
-                <w:b/>
-                <w:bCs/>
-                <w:highlight w:val="yellow"/>
+            <w:r>
+              <w:rPr>
+                <w:b/>
+                <w:bCs/>
               </w:rPr>
               <w:t>Acceptance test</w:t>
             </w:r>
             <w:r>
-              <w:rPr>
-                <w:highlight w:val="yellow"/>
-              </w:rPr>
               <w:t>:</w:t>
             </w:r>
           </w:p>
           <w:p>
             <w:r>
-              <w:rPr>
-                <w:highlight w:val="yellow"/>
-              </w:rPr>
               <w:t>Press the button, and the imported file disappears and the written text is removed.</w:t>
             </w:r>
             <w:r>
@@ -806,7 +710,27 @@
           </w:p>
           <w:p>
             <w:r>
-              <w:t>System should accept multiple sequences and the output should show results for all the sequences</w:t>
+              <w:t>A help screen e</w:t>
+            </w:r>
+            <w:r>
+              <w:t>xplainin</w:t>
+            </w:r>
+            <w:r>
+              <w:t xml:space="preserve">g the </w:t>
+            </w:r>
+            <w:proofErr w:type="spellStart"/>
+            <w:r>
+              <w:t>gui</w:t>
+            </w:r>
+            <w:proofErr w:type="spellEnd"/>
+            <w:r>
+              <w:t xml:space="preserve"> shows after clicki</w:t>
+            </w:r>
+            <w:r>
+              <w:t>ng the but</w:t>
+            </w:r>
+            <w:r>
+              <w:t>ton</w:t>
             </w:r>
           </w:p>
         </w:tc>
@@ -884,7 +808,15 @@
               <w:t>S</w:t>
             </w:r>
             <w:r>
-              <w:t>o that i know the search is running and the application has not frozen</w:t>
+              <w:t xml:space="preserve">o that </w:t>
+            </w:r>
+            <w:proofErr w:type="spellStart"/>
+            <w:r>
+              <w:t>i</w:t>
+            </w:r>
+            <w:proofErr w:type="spellEnd"/>
+            <w:r>
+              <w:t xml:space="preserve"> know the search is running and the application has not frozen</w:t>
             </w:r>
           </w:p>
         </w:tc>
@@ -931,7 +863,7 @@
         <w:pStyle w:val="Heading3"/>
       </w:pPr>
       <w:r>
-        <w:rPr/>
+        <w:lastRenderedPageBreak/>
         <w:t>Open and Export BLAST Output</w:t>
       </w:r>
     </w:p>
@@ -951,18 +883,16 @@
         <w:tc>
           <w:tcPr>
             <w:tcW w:w="8299" w:type="dxa"/>
-            <w:tcMar/>
-          </w:tcPr>
-          <w:p>
-            <w:r>
-              <w:rPr>
-                <w:b w:val="1"/>
-                <w:bCs w:val="1"/>
+          </w:tcPr>
+          <w:p>
+            <w:r>
+              <w:rPr>
+                <w:b/>
+                <w:bCs/>
               </w:rPr>
               <w:t>As a</w:t>
             </w:r>
             <w:r>
-              <w:rPr/>
               <w:t xml:space="preserve"> life science scientist</w:t>
             </w:r>
           </w:p>
@@ -975,22 +905,19 @@
         <w:tc>
           <w:tcPr>
             <w:tcW w:w="8299" w:type="dxa"/>
-            <w:tcMar/>
-          </w:tcPr>
-          <w:p>
-            <w:r>
-              <w:rPr>
-                <w:b w:val="1"/>
-                <w:bCs w:val="1"/>
+          </w:tcPr>
+          <w:p>
+            <w:r>
+              <w:rPr>
+                <w:b/>
+                <w:bCs/>
               </w:rPr>
               <w:t>I want</w:t>
             </w:r>
             <w:r>
-              <w:rPr/>
               <w:t xml:space="preserve"> to </w:t>
             </w:r>
             <w:r>
-              <w:rPr/>
               <w:t>open and export my BLAST results in different formats</w:t>
             </w:r>
           </w:p>
@@ -1003,34 +930,32 @@
         <w:tc>
           <w:tcPr>
             <w:tcW w:w="8299" w:type="dxa"/>
-            <w:tcMar/>
-          </w:tcPr>
-          <w:p>
-            <w:r>
-              <w:rPr>
-                <w:b w:val="1"/>
-                <w:bCs w:val="1"/>
+          </w:tcPr>
+          <w:p>
+            <w:r>
+              <w:rPr>
+                <w:b/>
+                <w:bCs/>
               </w:rPr>
               <w:t>S</w:t>
             </w:r>
             <w:r>
-              <w:rPr/>
               <w:t xml:space="preserve">o that </w:t>
             </w:r>
-            <w:r>
-              <w:rPr/>
+            <w:proofErr w:type="spellStart"/>
+            <w:r>
               <w:t>i</w:t>
             </w:r>
-            <w:r>
-              <w:rPr/>
+            <w:proofErr w:type="spellEnd"/>
+            <w:r>
               <w:t xml:space="preserve"> can save share and </w:t>
             </w:r>
-            <w:r>
-              <w:rPr/>
+            <w:proofErr w:type="spellStart"/>
+            <w:r>
               <w:t>futher</w:t>
             </w:r>
-            <w:r>
-              <w:rPr/>
+            <w:proofErr w:type="spellEnd"/>
+            <w:r>
               <w:t xml:space="preserve"> analyze my results outside of the application</w:t>
             </w:r>
           </w:p>
@@ -1043,50 +968,23 @@
         <w:tc>
           <w:tcPr>
             <w:tcW w:w="8299" w:type="dxa"/>
-            <w:tcMar/>
-          </w:tcPr>
-          <w:p>
-            <w:r>
-              <w:rPr>
-                <w:b w:val="1"/>
-                <w:bCs w:val="1"/>
+          </w:tcPr>
+          <w:p>
+            <w:r>
+              <w:rPr>
+                <w:b/>
+                <w:bCs/>
               </w:rPr>
               <w:t>Acceptance test:</w:t>
             </w:r>
           </w:p>
           <w:p>
-            <w:pPr>
-              <w:pStyle w:val="Normal"/>
-            </w:pPr>
-            <w:r>
-              <w:rPr>
-                <w:rFonts w:ascii="Times New Roman" w:hAnsi="Times New Roman" w:eastAsia="Times New Roman" w:cs="Times New Roman"/>
-                <w:noProof w:val="0"/>
-                <w:sz w:val="22"/>
+            <w:r>
+              <w:rPr>
+                <w:rFonts w:eastAsia="Times New Roman"/>
                 <w:szCs w:val="22"/>
-                <w:lang w:val="en-US"/>
-              </w:rPr>
-              <w:t xml:space="preserve">Run BLAST to open the output window, then export results to the desired location. The file should be saved correctly and </w:t>
-            </w:r>
-            <w:r>
-              <w:rPr>
-                <w:rFonts w:ascii="Times New Roman" w:hAnsi="Times New Roman" w:eastAsia="Times New Roman" w:cs="Times New Roman"/>
-                <w:noProof w:val="0"/>
-                <w:sz w:val="22"/>
-                <w:szCs w:val="22"/>
-                <w:lang w:val="en-US"/>
-              </w:rPr>
-              <w:t>contain</w:t>
-            </w:r>
-            <w:r>
-              <w:rPr>
-                <w:rFonts w:ascii="Times New Roman" w:hAnsi="Times New Roman" w:eastAsia="Times New Roman" w:cs="Times New Roman"/>
-                <w:noProof w:val="0"/>
-                <w:sz w:val="22"/>
-                <w:szCs w:val="22"/>
-                <w:lang w:val="en-US"/>
-              </w:rPr>
-              <w:t xml:space="preserve"> the expected results as shown in the output window.</w:t>
+              </w:rPr>
+              <w:t>Run BLAST to open the output window, then export results to the desired location. The file should be saved correctly and contain the expected results as shown in the output window.</w:t>
             </w:r>
           </w:p>
         </w:tc>
@@ -1098,7 +996,6 @@
         <w:pStyle w:val="Heading3"/>
       </w:pPr>
       <w:r>
-        <w:rPr/>
         <w:t>Button Tool Suggestion Statistics</w:t>
       </w:r>
     </w:p>
@@ -1118,18 +1015,16 @@
         <w:tc>
           <w:tcPr>
             <w:tcW w:w="8299" w:type="dxa"/>
-            <w:tcMar/>
-          </w:tcPr>
-          <w:p>
-            <w:r>
-              <w:rPr>
-                <w:b w:val="1"/>
-                <w:bCs w:val="1"/>
+          </w:tcPr>
+          <w:p>
+            <w:r>
+              <w:rPr>
+                <w:b/>
+                <w:bCs/>
               </w:rPr>
               <w:t>As a</w:t>
             </w:r>
             <w:r>
-              <w:rPr/>
               <w:t xml:space="preserve"> life science scientist</w:t>
             </w:r>
           </w:p>
@@ -1142,22 +1037,19 @@
         <w:tc>
           <w:tcPr>
             <w:tcW w:w="8299" w:type="dxa"/>
-            <w:tcMar/>
-          </w:tcPr>
-          <w:p>
-            <w:r>
-              <w:rPr>
-                <w:b w:val="1"/>
-                <w:bCs w:val="1"/>
+          </w:tcPr>
+          <w:p>
+            <w:r>
+              <w:rPr>
+                <w:b/>
+                <w:bCs/>
               </w:rPr>
               <w:t>I want</w:t>
             </w:r>
             <w:r>
-              <w:rPr/>
               <w:t xml:space="preserve"> to </w:t>
             </w:r>
             <w:r>
-              <w:rPr/>
               <w:t>receive tool suggestions based on statistics of my input sequence</w:t>
             </w:r>
           </w:p>
@@ -1170,39 +1062,28 @@
         <w:tc>
           <w:tcPr>
             <w:tcW w:w="8299" w:type="dxa"/>
-            <w:tcMar/>
-          </w:tcPr>
-          <w:p>
-            <w:r>
-              <w:rPr>
-                <w:b w:val="1"/>
-                <w:bCs w:val="1"/>
+          </w:tcPr>
+          <w:p>
+            <w:r>
+              <w:rPr>
+                <w:b/>
+                <w:bCs/>
               </w:rPr>
               <w:t>S</w:t>
             </w:r>
             <w:r>
-              <w:rPr/>
               <w:t xml:space="preserve">o that </w:t>
             </w:r>
-            <w:r>
-              <w:rPr/>
+            <w:proofErr w:type="spellStart"/>
+            <w:r>
               <w:t>i</w:t>
             </w:r>
-            <w:r>
-              <w:rPr/>
+            <w:proofErr w:type="spellEnd"/>
+            <w:r>
               <w:t xml:space="preserve"> </w:t>
             </w:r>
             <w:r>
-              <w:rPr/>
-              <w:t xml:space="preserve">can be guided toward the most </w:t>
-            </w:r>
-            <w:r>
-              <w:rPr/>
-              <w:t>appropriate next</w:t>
-            </w:r>
-            <w:r>
-              <w:rPr/>
-              <w:t xml:space="preserve"> analysis step depending on my sequence type and properties</w:t>
+              <w:t>can be guided toward the most appropriate next analysis step depending on my sequence type and properties</w:t>
             </w:r>
           </w:p>
         </w:tc>
@@ -1214,34 +1095,27 @@
         <w:tc>
           <w:tcPr>
             <w:tcW w:w="8299" w:type="dxa"/>
-            <w:tcMar/>
           </w:tcPr>
           <w:p>
             <w:pPr>
               <w:rPr>
-                <w:b w:val="1"/>
-                <w:bCs w:val="1"/>
+                <w:b/>
+                <w:bCs/>
               </w:rPr>
             </w:pPr>
             <w:r>
               <w:rPr>
-                <w:b w:val="1"/>
-                <w:bCs w:val="1"/>
+                <w:b/>
+                <w:bCs/>
               </w:rPr>
               <w:t>Acceptance test:</w:t>
             </w:r>
           </w:p>
           <w:p>
-            <w:pPr>
-              <w:pStyle w:val="Normal"/>
-            </w:pPr>
-            <w:r>
-              <w:rPr>
-                <w:rFonts w:ascii="Times New Roman" w:hAnsi="Times New Roman" w:eastAsia="Times New Roman" w:cs="Times New Roman"/>
-                <w:noProof w:val="0"/>
-                <w:sz w:val="22"/>
+            <w:r>
+              <w:rPr>
+                <w:rFonts w:eastAsia="Times New Roman"/>
                 <w:szCs w:val="22"/>
-                <w:lang w:val="en-US"/>
               </w:rPr>
               <w:t>Input a file and run statistics, and the suggestions section should appear, recommending the appropriate tool for DNA and protein.</w:t>
             </w:r>
@@ -1396,8 +1270,13 @@
             <w:r>
               <w:t xml:space="preserve">Having two </w:t>
             </w:r>
-            <w:r>
-              <w:t xml:space="preserve">tsv </w:t>
+            <w:proofErr w:type="spellStart"/>
+            <w:r>
+              <w:t>tsv</w:t>
+            </w:r>
+            <w:proofErr w:type="spellEnd"/>
+            <w:r>
+              <w:t xml:space="preserve"> </w:t>
             </w:r>
             <w:r>
               <w:t xml:space="preserve">files </w:t>
@@ -1732,6 +1611,7 @@
                 <w:b/>
                 <w:bCs/>
               </w:rPr>
+              <w:lastRenderedPageBreak/>
               <w:t>I want</w:t>
             </w:r>
             <w:r>
@@ -2280,6 +2160,7 @@
                 <w:b/>
                 <w:bCs/>
               </w:rPr>
+              <w:lastRenderedPageBreak/>
               <w:t>So that</w:t>
             </w:r>
             <w:r>
@@ -2321,7 +2202,15 @@
         <w:pStyle w:val="Heading3"/>
       </w:pPr>
       <w:r>
-        <w:t>BLASTP on default Uniprot database</w:t>
+        <w:t xml:space="preserve">BLASTP on default </w:t>
+      </w:r>
+      <w:proofErr w:type="spellStart"/>
+      <w:r>
+        <w:t>Uniprot</w:t>
+      </w:r>
+      <w:proofErr w:type="spellEnd"/>
+      <w:r>
+        <w:t xml:space="preserve"> database</w:t>
       </w:r>
     </w:p>
     <w:tbl>
@@ -2365,7 +2254,15 @@
               <w:t xml:space="preserve">perform BLASTP </w:t>
             </w:r>
             <w:r>
-              <w:t>using the default Uniprot database after I entered either a protein sequence in FASTA format in the therefore intended text box or uploaded a FASTA file of a protein sequence. After entering the sequence</w:t>
+              <w:t xml:space="preserve">using the default </w:t>
+            </w:r>
+            <w:proofErr w:type="spellStart"/>
+            <w:r>
+              <w:t>Uniprot</w:t>
+            </w:r>
+            <w:proofErr w:type="spellEnd"/>
+            <w:r>
+              <w:t xml:space="preserve"> database after I entered either a protein sequence in FASTA format in the therefore intended text box or uploaded a FASTA file of a protein sequence. After entering the sequence</w:t>
             </w:r>
             <w:r>
               <w:t>,</w:t>
@@ -2488,7 +2385,15 @@
               <w:t xml:space="preserve"> to </w:t>
             </w:r>
             <w:r>
-              <w:t xml:space="preserve">run the BLASTP tool using my own custom database provided in FASTA format. As with the default Uniprot database, the query protein sequence can be provided in text box in FASTA format or uploaded as a FASTA file. When I press the BLAST button, the BLASTP should run using my custom database.  </w:t>
+              <w:t xml:space="preserve">run the BLASTP tool using my own custom database provided in FASTA format. As with the default </w:t>
+            </w:r>
+            <w:proofErr w:type="spellStart"/>
+            <w:r>
+              <w:t>Uniprot</w:t>
+            </w:r>
+            <w:proofErr w:type="spellEnd"/>
+            <w:r>
+              <w:t xml:space="preserve"> database, the query protein sequence can be provided in text box in FASTA format or uploaded as a FASTA file. When I press the BLAST button, the BLASTP should run using my custom database.  </w:t>
             </w:r>
           </w:p>
         </w:tc>
@@ -2534,7 +2439,15 @@
           </w:p>
           <w:p>
             <w:r>
-              <w:t>After I put in either a protein sequence in FASTA format in the therefore intended text box or upload a FASTA file of a protein sequence and provide a custom database in FASTA format, the BLASTP output should be written to a file in my downloads folder and shown in a new window when I press the BLAST button. Importantly, it should not use the default Uniprot database when I provide my own database.</w:t>
+              <w:t xml:space="preserve">After I put in either a protein sequence in FASTA format in the therefore intended text box or upload a FASTA file of a protein sequence and provide a custom database in FASTA format, the BLASTP output should be written to a file in my downloads folder and shown in a new window when I press the BLAST button. Importantly, it should not use the default </w:t>
+            </w:r>
+            <w:proofErr w:type="spellStart"/>
+            <w:r>
+              <w:t>Uniprot</w:t>
+            </w:r>
+            <w:proofErr w:type="spellEnd"/>
+            <w:r>
+              <w:t xml:space="preserve"> database when I provide my own database.</w:t>
             </w:r>
           </w:p>
         </w:tc>
@@ -2598,6 +2511,7 @@
           <w:sz w:val="36"/>
           <w:szCs w:val="32"/>
         </w:rPr>
+        <w:lastRenderedPageBreak/>
         <w:t>Iteration 1</w:t>
       </w:r>
     </w:p>
@@ -2621,8 +2535,17 @@
           <w:b/>
           <w:bCs/>
         </w:rPr>
-        <w:t>Group A: EzBLAST</w:t>
-      </w:r>
+        <w:t xml:space="preserve">Group A: </w:t>
+      </w:r>
+      <w:proofErr w:type="spellStart"/>
+      <w:r>
+        <w:rPr>
+          <w:b/>
+          <w:bCs/>
+        </w:rPr>
+        <w:t>EzBLAST</w:t>
+      </w:r>
+      <w:proofErr w:type="spellEnd"/>
     </w:p>
     <w:p>
       <w:pPr>
@@ -2653,7 +2576,15 @@
     </w:p>
     <w:p>
       <w:r>
-        <w:t xml:space="preserve">The user is a life science scientist and wants to analyze their data. In this instance, we limit the input data to a fasta sequence of an unknown organism. </w:t>
+        <w:t xml:space="preserve">The user is a life science scientist and wants to analyze their data. In this instance, we limit the input data to a </w:t>
+      </w:r>
+      <w:proofErr w:type="spellStart"/>
+      <w:r>
+        <w:t>fasta</w:t>
+      </w:r>
+      <w:proofErr w:type="spellEnd"/>
+      <w:r>
+        <w:t xml:space="preserve"> sequence of an unknown organism. </w:t>
       </w:r>
     </w:p>
     <w:p/>
@@ -2705,10 +2636,10 @@
           <w:tcPr>
             <w:tcW w:w="8299" w:type="dxa"/>
             <w:tcBorders>
-              <w:top w:val="single" w:color="auto" w:sz="4" w:space="0"/>
-              <w:left w:val="single" w:color="auto" w:sz="4" w:space="0"/>
-              <w:bottom w:val="single" w:color="auto" w:sz="4" w:space="0"/>
-              <w:right w:val="single" w:color="auto" w:sz="4" w:space="0"/>
+              <w:top w:val="single" w:sz="4" w:space="0" w:color="auto"/>
+              <w:left w:val="single" w:sz="4" w:space="0" w:color="auto"/>
+              <w:bottom w:val="single" w:sz="4" w:space="0" w:color="auto"/>
+              <w:right w:val="single" w:sz="4" w:space="0" w:color="auto"/>
             </w:tcBorders>
             <w:hideMark/>
           </w:tcPr>
@@ -2724,10 +2655,10 @@
           <w:tcPr>
             <w:tcW w:w="8299" w:type="dxa"/>
             <w:tcBorders>
-              <w:top w:val="single" w:color="auto" w:sz="4" w:space="0"/>
-              <w:left w:val="single" w:color="auto" w:sz="4" w:space="0"/>
-              <w:bottom w:val="single" w:color="auto" w:sz="4" w:space="0"/>
-              <w:right w:val="single" w:color="auto" w:sz="4" w:space="0"/>
+              <w:top w:val="single" w:sz="4" w:space="0" w:color="auto"/>
+              <w:left w:val="single" w:sz="4" w:space="0" w:color="auto"/>
+              <w:bottom w:val="single" w:sz="4" w:space="0" w:color="auto"/>
+              <w:right w:val="single" w:sz="4" w:space="0" w:color="auto"/>
             </w:tcBorders>
             <w:hideMark/>
           </w:tcPr>
@@ -2743,10 +2674,10 @@
           <w:tcPr>
             <w:tcW w:w="8299" w:type="dxa"/>
             <w:tcBorders>
-              <w:top w:val="single" w:color="auto" w:sz="4" w:space="0"/>
-              <w:left w:val="single" w:color="auto" w:sz="4" w:space="0"/>
-              <w:bottom w:val="single" w:color="auto" w:sz="4" w:space="0"/>
-              <w:right w:val="single" w:color="auto" w:sz="4" w:space="0"/>
+              <w:top w:val="single" w:sz="4" w:space="0" w:color="auto"/>
+              <w:left w:val="single" w:sz="4" w:space="0" w:color="auto"/>
+              <w:bottom w:val="single" w:sz="4" w:space="0" w:color="auto"/>
+              <w:right w:val="single" w:sz="4" w:space="0" w:color="auto"/>
             </w:tcBorders>
             <w:hideMark/>
           </w:tcPr>
@@ -2762,10 +2693,10 @@
           <w:tcPr>
             <w:tcW w:w="8299" w:type="dxa"/>
             <w:tcBorders>
-              <w:top w:val="single" w:color="auto" w:sz="4" w:space="0"/>
-              <w:left w:val="single" w:color="auto" w:sz="4" w:space="0"/>
-              <w:bottom w:val="single" w:color="auto" w:sz="4" w:space="0"/>
-              <w:right w:val="single" w:color="auto" w:sz="4" w:space="0"/>
+              <w:top w:val="single" w:sz="4" w:space="0" w:color="auto"/>
+              <w:left w:val="single" w:sz="4" w:space="0" w:color="auto"/>
+              <w:bottom w:val="single" w:sz="4" w:space="0" w:color="auto"/>
+              <w:right w:val="single" w:sz="4" w:space="0" w:color="auto"/>
             </w:tcBorders>
             <w:hideMark/>
           </w:tcPr>
@@ -2786,10 +2717,10 @@
           <w:tcPr>
             <w:tcW w:w="8299" w:type="dxa"/>
             <w:tcBorders>
-              <w:top w:val="single" w:color="auto" w:sz="4" w:space="0"/>
-              <w:left w:val="single" w:color="auto" w:sz="4" w:space="0"/>
-              <w:bottom w:val="single" w:color="auto" w:sz="4" w:space="0"/>
-              <w:right w:val="single" w:color="auto" w:sz="4" w:space="0"/>
+              <w:top w:val="single" w:sz="4" w:space="0" w:color="auto"/>
+              <w:left w:val="single" w:sz="4" w:space="0" w:color="auto"/>
+              <w:bottom w:val="single" w:sz="4" w:space="0" w:color="auto"/>
+              <w:right w:val="single" w:sz="4" w:space="0" w:color="auto"/>
             </w:tcBorders>
             <w:hideMark/>
           </w:tcPr>
@@ -2835,10 +2766,10 @@
           <w:tcPr>
             <w:tcW w:w="8299" w:type="dxa"/>
             <w:tcBorders>
-              <w:top w:val="single" w:color="auto" w:sz="4" w:space="0"/>
-              <w:left w:val="single" w:color="auto" w:sz="4" w:space="0"/>
-              <w:bottom w:val="single" w:color="auto" w:sz="4" w:space="0"/>
-              <w:right w:val="single" w:color="auto" w:sz="4" w:space="0"/>
+              <w:top w:val="single" w:sz="4" w:space="0" w:color="auto"/>
+              <w:left w:val="single" w:sz="4" w:space="0" w:color="auto"/>
+              <w:bottom w:val="single" w:sz="4" w:space="0" w:color="auto"/>
+              <w:right w:val="single" w:sz="4" w:space="0" w:color="auto"/>
             </w:tcBorders>
             <w:hideMark/>
           </w:tcPr>
@@ -2854,10 +2785,10 @@
           <w:tcPr>
             <w:tcW w:w="8299" w:type="dxa"/>
             <w:tcBorders>
-              <w:top w:val="single" w:color="auto" w:sz="4" w:space="0"/>
-              <w:left w:val="single" w:color="auto" w:sz="4" w:space="0"/>
-              <w:bottom w:val="single" w:color="auto" w:sz="4" w:space="0"/>
-              <w:right w:val="single" w:color="auto" w:sz="4" w:space="0"/>
+              <w:top w:val="single" w:sz="4" w:space="0" w:color="auto"/>
+              <w:left w:val="single" w:sz="4" w:space="0" w:color="auto"/>
+              <w:bottom w:val="single" w:sz="4" w:space="0" w:color="auto"/>
+              <w:right w:val="single" w:sz="4" w:space="0" w:color="auto"/>
             </w:tcBorders>
             <w:hideMark/>
           </w:tcPr>
@@ -2873,10 +2804,10 @@
           <w:tcPr>
             <w:tcW w:w="8299" w:type="dxa"/>
             <w:tcBorders>
-              <w:top w:val="single" w:color="auto" w:sz="4" w:space="0"/>
-              <w:left w:val="single" w:color="auto" w:sz="4" w:space="0"/>
-              <w:bottom w:val="single" w:color="auto" w:sz="4" w:space="0"/>
-              <w:right w:val="single" w:color="auto" w:sz="4" w:space="0"/>
+              <w:top w:val="single" w:sz="4" w:space="0" w:color="auto"/>
+              <w:left w:val="single" w:sz="4" w:space="0" w:color="auto"/>
+              <w:bottom w:val="single" w:sz="4" w:space="0" w:color="auto"/>
+              <w:right w:val="single" w:sz="4" w:space="0" w:color="auto"/>
             </w:tcBorders>
             <w:hideMark/>
           </w:tcPr>
@@ -2892,10 +2823,10 @@
           <w:tcPr>
             <w:tcW w:w="8299" w:type="dxa"/>
             <w:tcBorders>
-              <w:top w:val="single" w:color="auto" w:sz="4" w:space="0"/>
-              <w:left w:val="single" w:color="auto" w:sz="4" w:space="0"/>
-              <w:bottom w:val="single" w:color="auto" w:sz="4" w:space="0"/>
-              <w:right w:val="single" w:color="auto" w:sz="4" w:space="0"/>
+              <w:top w:val="single" w:sz="4" w:space="0" w:color="auto"/>
+              <w:left w:val="single" w:sz="4" w:space="0" w:color="auto"/>
+              <w:bottom w:val="single" w:sz="4" w:space="0" w:color="auto"/>
+              <w:right w:val="single" w:sz="4" w:space="0" w:color="auto"/>
             </w:tcBorders>
           </w:tcPr>
           <w:p>
@@ -2911,10 +2842,10 @@
           <w:tcPr>
             <w:tcW w:w="8299" w:type="dxa"/>
             <w:tcBorders>
-              <w:top w:val="single" w:color="auto" w:sz="4" w:space="0"/>
-              <w:left w:val="single" w:color="auto" w:sz="4" w:space="0"/>
-              <w:bottom w:val="single" w:color="auto" w:sz="4" w:space="0"/>
-              <w:right w:val="single" w:color="auto" w:sz="4" w:space="0"/>
+              <w:top w:val="single" w:sz="4" w:space="0" w:color="auto"/>
+              <w:left w:val="single" w:sz="4" w:space="0" w:color="auto"/>
+              <w:bottom w:val="single" w:sz="4" w:space="0" w:color="auto"/>
+              <w:right w:val="single" w:sz="4" w:space="0" w:color="auto"/>
             </w:tcBorders>
           </w:tcPr>
           <w:p>
@@ -2963,10 +2894,10 @@
           <w:tcPr>
             <w:tcW w:w="8299" w:type="dxa"/>
             <w:tcBorders>
-              <w:top w:val="single" w:color="auto" w:sz="4" w:space="0"/>
-              <w:left w:val="single" w:color="auto" w:sz="4" w:space="0"/>
-              <w:bottom w:val="single" w:color="auto" w:sz="4" w:space="0"/>
-              <w:right w:val="single" w:color="auto" w:sz="4" w:space="0"/>
+              <w:top w:val="single" w:sz="4" w:space="0" w:color="auto"/>
+              <w:left w:val="single" w:sz="4" w:space="0" w:color="auto"/>
+              <w:bottom w:val="single" w:sz="4" w:space="0" w:color="auto"/>
+              <w:right w:val="single" w:sz="4" w:space="0" w:color="auto"/>
             </w:tcBorders>
             <w:hideMark/>
           </w:tcPr>
@@ -2982,10 +2913,10 @@
           <w:tcPr>
             <w:tcW w:w="8299" w:type="dxa"/>
             <w:tcBorders>
-              <w:top w:val="single" w:color="auto" w:sz="4" w:space="0"/>
-              <w:left w:val="single" w:color="auto" w:sz="4" w:space="0"/>
-              <w:bottom w:val="single" w:color="auto" w:sz="4" w:space="0"/>
-              <w:right w:val="single" w:color="auto" w:sz="4" w:space="0"/>
+              <w:top w:val="single" w:sz="4" w:space="0" w:color="auto"/>
+              <w:left w:val="single" w:sz="4" w:space="0" w:color="auto"/>
+              <w:bottom w:val="single" w:sz="4" w:space="0" w:color="auto"/>
+              <w:right w:val="single" w:sz="4" w:space="0" w:color="auto"/>
             </w:tcBorders>
             <w:hideMark/>
           </w:tcPr>
@@ -3001,10 +2932,10 @@
           <w:tcPr>
             <w:tcW w:w="8299" w:type="dxa"/>
             <w:tcBorders>
-              <w:top w:val="single" w:color="auto" w:sz="4" w:space="0"/>
-              <w:left w:val="single" w:color="auto" w:sz="4" w:space="0"/>
-              <w:bottom w:val="single" w:color="auto" w:sz="4" w:space="0"/>
-              <w:right w:val="single" w:color="auto" w:sz="4" w:space="0"/>
+              <w:top w:val="single" w:sz="4" w:space="0" w:color="auto"/>
+              <w:left w:val="single" w:sz="4" w:space="0" w:color="auto"/>
+              <w:bottom w:val="single" w:sz="4" w:space="0" w:color="auto"/>
+              <w:right w:val="single" w:sz="4" w:space="0" w:color="auto"/>
             </w:tcBorders>
             <w:hideMark/>
           </w:tcPr>
@@ -3020,10 +2951,10 @@
           <w:tcPr>
             <w:tcW w:w="8299" w:type="dxa"/>
             <w:tcBorders>
-              <w:top w:val="single" w:color="auto" w:sz="4" w:space="0"/>
-              <w:left w:val="single" w:color="auto" w:sz="4" w:space="0"/>
-              <w:bottom w:val="single" w:color="auto" w:sz="4" w:space="0"/>
-              <w:right w:val="single" w:color="auto" w:sz="4" w:space="0"/>
+              <w:top w:val="single" w:sz="4" w:space="0" w:color="auto"/>
+              <w:left w:val="single" w:sz="4" w:space="0" w:color="auto"/>
+              <w:bottom w:val="single" w:sz="4" w:space="0" w:color="auto"/>
+              <w:right w:val="single" w:sz="4" w:space="0" w:color="auto"/>
             </w:tcBorders>
             <w:hideMark/>
           </w:tcPr>
@@ -3053,10 +2984,10 @@
           <w:tcPr>
             <w:tcW w:w="8299" w:type="dxa"/>
             <w:tcBorders>
-              <w:top w:val="single" w:color="auto" w:sz="4" w:space="0"/>
-              <w:left w:val="single" w:color="auto" w:sz="4" w:space="0"/>
-              <w:bottom w:val="single" w:color="auto" w:sz="4" w:space="0"/>
-              <w:right w:val="single" w:color="auto" w:sz="4" w:space="0"/>
+              <w:top w:val="single" w:sz="4" w:space="0" w:color="auto"/>
+              <w:left w:val="single" w:sz="4" w:space="0" w:color="auto"/>
+              <w:bottom w:val="single" w:sz="4" w:space="0" w:color="auto"/>
+              <w:right w:val="single" w:sz="4" w:space="0" w:color="auto"/>
             </w:tcBorders>
           </w:tcPr>
           <w:p>
@@ -3098,10 +3029,10 @@
           <w:tcPr>
             <w:tcW w:w="8299" w:type="dxa"/>
             <w:tcBorders>
-              <w:top w:val="single" w:color="auto" w:sz="4" w:space="0"/>
-              <w:left w:val="single" w:color="auto" w:sz="4" w:space="0"/>
-              <w:bottom w:val="single" w:color="auto" w:sz="4" w:space="0"/>
-              <w:right w:val="single" w:color="auto" w:sz="4" w:space="0"/>
+              <w:top w:val="single" w:sz="4" w:space="0" w:color="auto"/>
+              <w:left w:val="single" w:sz="4" w:space="0" w:color="auto"/>
+              <w:bottom w:val="single" w:sz="4" w:space="0" w:color="auto"/>
+              <w:right w:val="single" w:sz="4" w:space="0" w:color="auto"/>
             </w:tcBorders>
             <w:hideMark/>
           </w:tcPr>
@@ -3117,10 +3048,10 @@
           <w:tcPr>
             <w:tcW w:w="8299" w:type="dxa"/>
             <w:tcBorders>
-              <w:top w:val="single" w:color="auto" w:sz="4" w:space="0"/>
-              <w:left w:val="single" w:color="auto" w:sz="4" w:space="0"/>
-              <w:bottom w:val="single" w:color="auto" w:sz="4" w:space="0"/>
-              <w:right w:val="single" w:color="auto" w:sz="4" w:space="0"/>
+              <w:top w:val="single" w:sz="4" w:space="0" w:color="auto"/>
+              <w:left w:val="single" w:sz="4" w:space="0" w:color="auto"/>
+              <w:bottom w:val="single" w:sz="4" w:space="0" w:color="auto"/>
+              <w:right w:val="single" w:sz="4" w:space="0" w:color="auto"/>
             </w:tcBorders>
             <w:hideMark/>
           </w:tcPr>
@@ -3136,10 +3067,10 @@
           <w:tcPr>
             <w:tcW w:w="8299" w:type="dxa"/>
             <w:tcBorders>
-              <w:top w:val="single" w:color="auto" w:sz="4" w:space="0"/>
-              <w:left w:val="single" w:color="auto" w:sz="4" w:space="0"/>
-              <w:bottom w:val="single" w:color="auto" w:sz="4" w:space="0"/>
-              <w:right w:val="single" w:color="auto" w:sz="4" w:space="0"/>
+              <w:top w:val="single" w:sz="4" w:space="0" w:color="auto"/>
+              <w:left w:val="single" w:sz="4" w:space="0" w:color="auto"/>
+              <w:bottom w:val="single" w:sz="4" w:space="0" w:color="auto"/>
+              <w:right w:val="single" w:sz="4" w:space="0" w:color="auto"/>
             </w:tcBorders>
             <w:hideMark/>
           </w:tcPr>
@@ -3155,10 +3086,10 @@
           <w:tcPr>
             <w:tcW w:w="8299" w:type="dxa"/>
             <w:tcBorders>
-              <w:top w:val="single" w:color="auto" w:sz="4" w:space="0"/>
-              <w:left w:val="single" w:color="auto" w:sz="4" w:space="0"/>
-              <w:bottom w:val="single" w:color="auto" w:sz="4" w:space="0"/>
-              <w:right w:val="single" w:color="auto" w:sz="4" w:space="0"/>
+              <w:top w:val="single" w:sz="4" w:space="0" w:color="auto"/>
+              <w:left w:val="single" w:sz="4" w:space="0" w:color="auto"/>
+              <w:bottom w:val="single" w:sz="4" w:space="0" w:color="auto"/>
+              <w:right w:val="single" w:sz="4" w:space="0" w:color="auto"/>
             </w:tcBorders>
             <w:hideMark/>
           </w:tcPr>
@@ -3179,10 +3110,10 @@
           <w:tcPr>
             <w:tcW w:w="8299" w:type="dxa"/>
             <w:tcBorders>
-              <w:top w:val="single" w:color="auto" w:sz="4" w:space="0"/>
-              <w:left w:val="single" w:color="auto" w:sz="4" w:space="0"/>
-              <w:bottom w:val="single" w:color="auto" w:sz="4" w:space="0"/>
-              <w:right w:val="single" w:color="auto" w:sz="4" w:space="0"/>
+              <w:top w:val="single" w:sz="4" w:space="0" w:color="auto"/>
+              <w:left w:val="single" w:sz="4" w:space="0" w:color="auto"/>
+              <w:bottom w:val="single" w:sz="4" w:space="0" w:color="auto"/>
+              <w:right w:val="single" w:sz="4" w:space="0" w:color="auto"/>
             </w:tcBorders>
           </w:tcPr>
           <w:p>
@@ -3229,10 +3160,10 @@
           <w:tcPr>
             <w:tcW w:w="8299" w:type="dxa"/>
             <w:tcBorders>
-              <w:top w:val="single" w:color="auto" w:sz="4" w:space="0"/>
-              <w:left w:val="single" w:color="auto" w:sz="4" w:space="0"/>
-              <w:bottom w:val="single" w:color="auto" w:sz="4" w:space="0"/>
-              <w:right w:val="single" w:color="auto" w:sz="4" w:space="0"/>
+              <w:top w:val="single" w:sz="4" w:space="0" w:color="auto"/>
+              <w:left w:val="single" w:sz="4" w:space="0" w:color="auto"/>
+              <w:bottom w:val="single" w:sz="4" w:space="0" w:color="auto"/>
+              <w:right w:val="single" w:sz="4" w:space="0" w:color="auto"/>
             </w:tcBorders>
             <w:hideMark/>
           </w:tcPr>
@@ -3248,16 +3179,25 @@
           <w:tcPr>
             <w:tcW w:w="8299" w:type="dxa"/>
             <w:tcBorders>
-              <w:top w:val="single" w:color="auto" w:sz="4" w:space="0"/>
-              <w:left w:val="single" w:color="auto" w:sz="4" w:space="0"/>
-              <w:bottom w:val="single" w:color="auto" w:sz="4" w:space="0"/>
-              <w:right w:val="single" w:color="auto" w:sz="4" w:space="0"/>
+              <w:top w:val="single" w:sz="4" w:space="0" w:color="auto"/>
+              <w:left w:val="single" w:sz="4" w:space="0" w:color="auto"/>
+              <w:bottom w:val="single" w:sz="4" w:space="0" w:color="auto"/>
+              <w:right w:val="single" w:sz="4" w:space="0" w:color="auto"/>
             </w:tcBorders>
             <w:hideMark/>
           </w:tcPr>
           <w:p>
             <w:r>
-              <w:t>I want to have some important statistics for my sequence be displayed, examples: CG%, Tm ( for primers ) , reverse sequence, condiment, self-anealing, molecule weigh.</w:t>
+              <w:lastRenderedPageBreak/>
+              <w:t>I want to have some important statistics for my sequence be displayed, examples: CG%, Tm ( for primers ) , reverse sequence, condiment, self-</w:t>
+            </w:r>
+            <w:proofErr w:type="spellStart"/>
+            <w:r>
+              <w:t>anealing</w:t>
+            </w:r>
+            <w:proofErr w:type="spellEnd"/>
+            <w:r>
+              <w:t>, molecule weigh.</w:t>
             </w:r>
           </w:p>
         </w:tc>
@@ -3267,10 +3207,10 @@
           <w:tcPr>
             <w:tcW w:w="8299" w:type="dxa"/>
             <w:tcBorders>
-              <w:top w:val="single" w:color="auto" w:sz="4" w:space="0"/>
-              <w:left w:val="single" w:color="auto" w:sz="4" w:space="0"/>
-              <w:bottom w:val="single" w:color="auto" w:sz="4" w:space="0"/>
-              <w:right w:val="single" w:color="auto" w:sz="4" w:space="0"/>
+              <w:top w:val="single" w:sz="4" w:space="0" w:color="auto"/>
+              <w:left w:val="single" w:sz="4" w:space="0" w:color="auto"/>
+              <w:bottom w:val="single" w:sz="4" w:space="0" w:color="auto"/>
+              <w:right w:val="single" w:sz="4" w:space="0" w:color="auto"/>
             </w:tcBorders>
             <w:hideMark/>
           </w:tcPr>
@@ -3286,10 +3226,10 @@
           <w:tcPr>
             <w:tcW w:w="8299" w:type="dxa"/>
             <w:tcBorders>
-              <w:top w:val="single" w:color="auto" w:sz="4" w:space="0"/>
-              <w:left w:val="single" w:color="auto" w:sz="4" w:space="0"/>
-              <w:bottom w:val="single" w:color="auto" w:sz="4" w:space="0"/>
-              <w:right w:val="single" w:color="auto" w:sz="4" w:space="0"/>
+              <w:top w:val="single" w:sz="4" w:space="0" w:color="auto"/>
+              <w:left w:val="single" w:sz="4" w:space="0" w:color="auto"/>
+              <w:bottom w:val="single" w:sz="4" w:space="0" w:color="auto"/>
+              <w:right w:val="single" w:sz="4" w:space="0" w:color="auto"/>
             </w:tcBorders>
             <w:hideMark/>
           </w:tcPr>
@@ -3310,10 +3250,10 @@
           <w:tcPr>
             <w:tcW w:w="8299" w:type="dxa"/>
             <w:tcBorders>
-              <w:top w:val="single" w:color="auto" w:sz="4" w:space="0"/>
-              <w:left w:val="single" w:color="auto" w:sz="4" w:space="0"/>
-              <w:bottom w:val="single" w:color="auto" w:sz="4" w:space="0"/>
-              <w:right w:val="single" w:color="auto" w:sz="4" w:space="0"/>
+              <w:top w:val="single" w:sz="4" w:space="0" w:color="auto"/>
+              <w:left w:val="single" w:sz="4" w:space="0" w:color="auto"/>
+              <w:bottom w:val="single" w:sz="4" w:space="0" w:color="auto"/>
+              <w:right w:val="single" w:sz="4" w:space="0" w:color="auto"/>
             </w:tcBorders>
           </w:tcPr>
           <w:p>
@@ -3355,10 +3295,10 @@
           <w:tcPr>
             <w:tcW w:w="8299" w:type="dxa"/>
             <w:tcBorders>
-              <w:top w:val="single" w:color="auto" w:sz="4" w:space="0"/>
-              <w:left w:val="single" w:color="auto" w:sz="4" w:space="0"/>
-              <w:bottom w:val="single" w:color="auto" w:sz="4" w:space="0"/>
-              <w:right w:val="single" w:color="auto" w:sz="4" w:space="0"/>
+              <w:top w:val="single" w:sz="4" w:space="0" w:color="auto"/>
+              <w:left w:val="single" w:sz="4" w:space="0" w:color="auto"/>
+              <w:bottom w:val="single" w:sz="4" w:space="0" w:color="auto"/>
+              <w:right w:val="single" w:sz="4" w:space="0" w:color="auto"/>
             </w:tcBorders>
             <w:hideMark/>
           </w:tcPr>
@@ -3374,16 +3314,32 @@
           <w:tcPr>
             <w:tcW w:w="8299" w:type="dxa"/>
             <w:tcBorders>
-              <w:top w:val="single" w:color="auto" w:sz="4" w:space="0"/>
-              <w:left w:val="single" w:color="auto" w:sz="4" w:space="0"/>
-              <w:bottom w:val="single" w:color="auto" w:sz="4" w:space="0"/>
-              <w:right w:val="single" w:color="auto" w:sz="4" w:space="0"/>
+              <w:top w:val="single" w:sz="4" w:space="0" w:color="auto"/>
+              <w:left w:val="single" w:sz="4" w:space="0" w:color="auto"/>
+              <w:bottom w:val="single" w:sz="4" w:space="0" w:color="auto"/>
+              <w:right w:val="single" w:sz="4" w:space="0" w:color="auto"/>
             </w:tcBorders>
             <w:hideMark/>
           </w:tcPr>
           <w:p>
             <w:r>
-              <w:t>I want to be able to run a blastp tool that saves the output of my best matches to a fastafile.</w:t>
+              <w:t xml:space="preserve">I want to be able to run a </w:t>
+            </w:r>
+            <w:proofErr w:type="spellStart"/>
+            <w:r>
+              <w:t>blastp</w:t>
+            </w:r>
+            <w:proofErr w:type="spellEnd"/>
+            <w:r>
+              <w:t xml:space="preserve"> tool that saves the output of my best matches to a </w:t>
+            </w:r>
+            <w:proofErr w:type="spellStart"/>
+            <w:r>
+              <w:t>fastafile</w:t>
+            </w:r>
+            <w:proofErr w:type="spellEnd"/>
+            <w:r>
+              <w:t>.</w:t>
             </w:r>
           </w:p>
         </w:tc>
@@ -3393,16 +3349,24 @@
           <w:tcPr>
             <w:tcW w:w="8299" w:type="dxa"/>
             <w:tcBorders>
-              <w:top w:val="single" w:color="auto" w:sz="4" w:space="0"/>
-              <w:left w:val="single" w:color="auto" w:sz="4" w:space="0"/>
-              <w:bottom w:val="single" w:color="auto" w:sz="4" w:space="0"/>
-              <w:right w:val="single" w:color="auto" w:sz="4" w:space="0"/>
+              <w:top w:val="single" w:sz="4" w:space="0" w:color="auto"/>
+              <w:left w:val="single" w:sz="4" w:space="0" w:color="auto"/>
+              <w:bottom w:val="single" w:sz="4" w:space="0" w:color="auto"/>
+              <w:right w:val="single" w:sz="4" w:space="0" w:color="auto"/>
             </w:tcBorders>
             <w:hideMark/>
           </w:tcPr>
           <w:p>
             <w:r>
-              <w:t xml:space="preserve">So that I can at a later point look back at my blastp results without running the computational expensive algorithm again. </w:t>
+              <w:t xml:space="preserve">So that I can at a later point look back at my </w:t>
+            </w:r>
+            <w:proofErr w:type="spellStart"/>
+            <w:r>
+              <w:t>blastp</w:t>
+            </w:r>
+            <w:proofErr w:type="spellEnd"/>
+            <w:r>
+              <w:t xml:space="preserve"> results without running the computational expensive algorithm again. </w:t>
             </w:r>
           </w:p>
         </w:tc>
@@ -3412,10 +3376,10 @@
           <w:tcPr>
             <w:tcW w:w="8299" w:type="dxa"/>
             <w:tcBorders>
-              <w:top w:val="single" w:color="auto" w:sz="4" w:space="0"/>
-              <w:left w:val="single" w:color="auto" w:sz="4" w:space="0"/>
-              <w:bottom w:val="single" w:color="auto" w:sz="4" w:space="0"/>
-              <w:right w:val="single" w:color="auto" w:sz="4" w:space="0"/>
+              <w:top w:val="single" w:sz="4" w:space="0" w:color="auto"/>
+              <w:left w:val="single" w:sz="4" w:space="0" w:color="auto"/>
+              <w:bottom w:val="single" w:sz="4" w:space="0" w:color="auto"/>
+              <w:right w:val="single" w:sz="4" w:space="0" w:color="auto"/>
             </w:tcBorders>
             <w:hideMark/>
           </w:tcPr>
@@ -3425,8 +3389,29 @@
             </w:r>
           </w:p>
           <w:p>
-            <w:r>
-              <w:t xml:space="preserve">Fastafile with blastp  output is created and saved in a place that is to be determined after blastp is run.  </w:t>
+            <w:proofErr w:type="spellStart"/>
+            <w:r>
+              <w:t>Fastafile</w:t>
+            </w:r>
+            <w:proofErr w:type="spellEnd"/>
+            <w:r>
+              <w:t xml:space="preserve"> with </w:t>
+            </w:r>
+            <w:proofErr w:type="spellStart"/>
+            <w:r>
+              <w:t>blastp</w:t>
+            </w:r>
+            <w:proofErr w:type="spellEnd"/>
+            <w:r>
+              <w:t xml:space="preserve">  output is created and saved in a place that is to be determined after </w:t>
+            </w:r>
+            <w:proofErr w:type="spellStart"/>
+            <w:r>
+              <w:t>blastp</w:t>
+            </w:r>
+            <w:proofErr w:type="spellEnd"/>
+            <w:r>
+              <w:t xml:space="preserve"> is run.  </w:t>
             </w:r>
           </w:p>
         </w:tc>
@@ -3436,10 +3421,10 @@
           <w:tcPr>
             <w:tcW w:w="8299" w:type="dxa"/>
             <w:tcBorders>
-              <w:top w:val="single" w:color="auto" w:sz="4" w:space="0"/>
-              <w:left w:val="single" w:color="auto" w:sz="4" w:space="0"/>
-              <w:bottom w:val="single" w:color="auto" w:sz="4" w:space="0"/>
-              <w:right w:val="single" w:color="auto" w:sz="4" w:space="0"/>
+              <w:top w:val="single" w:sz="4" w:space="0" w:color="auto"/>
+              <w:left w:val="single" w:sz="4" w:space="0" w:color="auto"/>
+              <w:bottom w:val="single" w:sz="4" w:space="0" w:color="auto"/>
+              <w:right w:val="single" w:sz="4" w:space="0" w:color="auto"/>
             </w:tcBorders>
           </w:tcPr>
           <w:p>
@@ -3464,7 +3449,23 @@
           <w:b/>
           <w:bCs/>
         </w:rPr>
-        <w:t>Upload fasta file</w:t>
+        <w:t xml:space="preserve">Upload </w:t>
+      </w:r>
+      <w:proofErr w:type="spellStart"/>
+      <w:r>
+        <w:rPr>
+          <w:b/>
+          <w:bCs/>
+        </w:rPr>
+        <w:t>fasta</w:t>
+      </w:r>
+      <w:proofErr w:type="spellEnd"/>
+      <w:r>
+        <w:rPr>
+          <w:b/>
+          <w:bCs/>
+        </w:rPr>
+        <w:t xml:space="preserve"> file</w:t>
       </w:r>
     </w:p>
     <w:tbl>
@@ -3481,10 +3482,10 @@
           <w:tcPr>
             <w:tcW w:w="8299" w:type="dxa"/>
             <w:tcBorders>
-              <w:top w:val="single" w:color="auto" w:sz="4" w:space="0"/>
-              <w:left w:val="single" w:color="auto" w:sz="4" w:space="0"/>
-              <w:bottom w:val="single" w:color="auto" w:sz="4" w:space="0"/>
-              <w:right w:val="single" w:color="auto" w:sz="4" w:space="0"/>
+              <w:top w:val="single" w:sz="4" w:space="0" w:color="auto"/>
+              <w:left w:val="single" w:sz="4" w:space="0" w:color="auto"/>
+              <w:bottom w:val="single" w:sz="4" w:space="0" w:color="auto"/>
+              <w:right w:val="single" w:sz="4" w:space="0" w:color="auto"/>
             </w:tcBorders>
             <w:hideMark/>
           </w:tcPr>
@@ -3500,10 +3501,10 @@
           <w:tcPr>
             <w:tcW w:w="8299" w:type="dxa"/>
             <w:tcBorders>
-              <w:top w:val="single" w:color="auto" w:sz="4" w:space="0"/>
-              <w:left w:val="single" w:color="auto" w:sz="4" w:space="0"/>
-              <w:bottom w:val="single" w:color="auto" w:sz="4" w:space="0"/>
-              <w:right w:val="single" w:color="auto" w:sz="4" w:space="0"/>
+              <w:top w:val="single" w:sz="4" w:space="0" w:color="auto"/>
+              <w:left w:val="single" w:sz="4" w:space="0" w:color="auto"/>
+              <w:bottom w:val="single" w:sz="4" w:space="0" w:color="auto"/>
+              <w:right w:val="single" w:sz="4" w:space="0" w:color="auto"/>
             </w:tcBorders>
             <w:hideMark/>
           </w:tcPr>
@@ -3519,16 +3520,24 @@
           <w:tcPr>
             <w:tcW w:w="8299" w:type="dxa"/>
             <w:tcBorders>
-              <w:top w:val="single" w:color="auto" w:sz="4" w:space="0"/>
-              <w:left w:val="single" w:color="auto" w:sz="4" w:space="0"/>
-              <w:bottom w:val="single" w:color="auto" w:sz="4" w:space="0"/>
-              <w:right w:val="single" w:color="auto" w:sz="4" w:space="0"/>
+              <w:top w:val="single" w:sz="4" w:space="0" w:color="auto"/>
+              <w:left w:val="single" w:sz="4" w:space="0" w:color="auto"/>
+              <w:bottom w:val="single" w:sz="4" w:space="0" w:color="auto"/>
+              <w:right w:val="single" w:sz="4" w:space="0" w:color="auto"/>
             </w:tcBorders>
             <w:hideMark/>
           </w:tcPr>
           <w:p>
             <w:r>
-              <w:t>So that the sequence file can be inserted into the BLAST command. Name of the file is displayed after uploading. If not accepted display the message ‘ file is not a fasta file’</w:t>
+              <w:t xml:space="preserve">So that the sequence file can be inserted into the BLAST command. Name of the file is displayed after uploading. If not accepted display the message ‘ file is not a </w:t>
+            </w:r>
+            <w:proofErr w:type="spellStart"/>
+            <w:r>
+              <w:t>fasta</w:t>
+            </w:r>
+            <w:proofErr w:type="spellEnd"/>
+            <w:r>
+              <w:t xml:space="preserve"> file’</w:t>
             </w:r>
           </w:p>
         </w:tc>
@@ -3538,10 +3547,10 @@
           <w:tcPr>
             <w:tcW w:w="8299" w:type="dxa"/>
             <w:tcBorders>
-              <w:top w:val="single" w:color="auto" w:sz="4" w:space="0"/>
-              <w:left w:val="single" w:color="auto" w:sz="4" w:space="0"/>
-              <w:bottom w:val="single" w:color="auto" w:sz="4" w:space="0"/>
-              <w:right w:val="single" w:color="auto" w:sz="4" w:space="0"/>
+              <w:top w:val="single" w:sz="4" w:space="0" w:color="auto"/>
+              <w:left w:val="single" w:sz="4" w:space="0" w:color="auto"/>
+              <w:bottom w:val="single" w:sz="4" w:space="0" w:color="auto"/>
+              <w:right w:val="single" w:sz="4" w:space="0" w:color="auto"/>
             </w:tcBorders>
             <w:hideMark/>
           </w:tcPr>
@@ -3552,7 +3561,23 @@
           </w:p>
           <w:p>
             <w:r>
-              <w:t xml:space="preserve">Has to be a fasta file. A fasta at the end of the file name. Sequence begins with  &gt;  </w:t>
+              <w:t xml:space="preserve">Has to be a </w:t>
+            </w:r>
+            <w:proofErr w:type="spellStart"/>
+            <w:r>
+              <w:t>fasta</w:t>
+            </w:r>
+            <w:proofErr w:type="spellEnd"/>
+            <w:r>
+              <w:t xml:space="preserve"> file. A </w:t>
+            </w:r>
+            <w:proofErr w:type="spellStart"/>
+            <w:r>
+              <w:t>fasta</w:t>
+            </w:r>
+            <w:proofErr w:type="spellEnd"/>
+            <w:r>
+              <w:t xml:space="preserve"> at the end of the file name. Sequence begins with  &gt;  </w:t>
             </w:r>
           </w:p>
         </w:tc>
@@ -3562,10 +3587,10 @@
           <w:tcPr>
             <w:tcW w:w="8299" w:type="dxa"/>
             <w:tcBorders>
-              <w:top w:val="single" w:color="auto" w:sz="4" w:space="0"/>
-              <w:left w:val="single" w:color="auto" w:sz="4" w:space="0"/>
-              <w:bottom w:val="single" w:color="auto" w:sz="4" w:space="0"/>
-              <w:right w:val="single" w:color="auto" w:sz="4" w:space="0"/>
+              <w:top w:val="single" w:sz="4" w:space="0" w:color="auto"/>
+              <w:left w:val="single" w:sz="4" w:space="0" w:color="auto"/>
+              <w:bottom w:val="single" w:sz="4" w:space="0" w:color="auto"/>
+              <w:right w:val="single" w:sz="4" w:space="0" w:color="auto"/>
             </w:tcBorders>
           </w:tcPr>
           <w:p>
@@ -3614,10 +3639,10 @@
           <w:tcPr>
             <w:tcW w:w="8299" w:type="dxa"/>
             <w:tcBorders>
-              <w:top w:val="single" w:color="auto" w:sz="4" w:space="0"/>
-              <w:left w:val="single" w:color="auto" w:sz="4" w:space="0"/>
-              <w:bottom w:val="single" w:color="auto" w:sz="4" w:space="0"/>
-              <w:right w:val="single" w:color="auto" w:sz="4" w:space="0"/>
+              <w:top w:val="single" w:sz="4" w:space="0" w:color="auto"/>
+              <w:left w:val="single" w:sz="4" w:space="0" w:color="auto"/>
+              <w:bottom w:val="single" w:sz="4" w:space="0" w:color="auto"/>
+              <w:right w:val="single" w:sz="4" w:space="0" w:color="auto"/>
             </w:tcBorders>
             <w:hideMark/>
           </w:tcPr>
@@ -3633,10 +3658,10 @@
           <w:tcPr>
             <w:tcW w:w="8299" w:type="dxa"/>
             <w:tcBorders>
-              <w:top w:val="single" w:color="auto" w:sz="4" w:space="0"/>
-              <w:left w:val="single" w:color="auto" w:sz="4" w:space="0"/>
-              <w:bottom w:val="single" w:color="auto" w:sz="4" w:space="0"/>
-              <w:right w:val="single" w:color="auto" w:sz="4" w:space="0"/>
+              <w:top w:val="single" w:sz="4" w:space="0" w:color="auto"/>
+              <w:left w:val="single" w:sz="4" w:space="0" w:color="auto"/>
+              <w:bottom w:val="single" w:sz="4" w:space="0" w:color="auto"/>
+              <w:right w:val="single" w:sz="4" w:space="0" w:color="auto"/>
             </w:tcBorders>
             <w:hideMark/>
           </w:tcPr>
@@ -3652,16 +3677,24 @@
           <w:tcPr>
             <w:tcW w:w="8299" w:type="dxa"/>
             <w:tcBorders>
-              <w:top w:val="single" w:color="auto" w:sz="4" w:space="0"/>
-              <w:left w:val="single" w:color="auto" w:sz="4" w:space="0"/>
-              <w:bottom w:val="single" w:color="auto" w:sz="4" w:space="0"/>
-              <w:right w:val="single" w:color="auto" w:sz="4" w:space="0"/>
+              <w:top w:val="single" w:sz="4" w:space="0" w:color="auto"/>
+              <w:left w:val="single" w:sz="4" w:space="0" w:color="auto"/>
+              <w:bottom w:val="single" w:sz="4" w:space="0" w:color="auto"/>
+              <w:right w:val="single" w:sz="4" w:space="0" w:color="auto"/>
             </w:tcBorders>
             <w:hideMark/>
           </w:tcPr>
           <w:p>
             <w:r>
-              <w:t>So that I can perform simple task at any pace,s DNA-S protein, reverse complimentary, etc.</w:t>
+              <w:t xml:space="preserve">So that I can perform simple task at any </w:t>
+            </w:r>
+            <w:proofErr w:type="spellStart"/>
+            <w:r>
+              <w:t>pace,s</w:t>
+            </w:r>
+            <w:proofErr w:type="spellEnd"/>
+            <w:r>
+              <w:t xml:space="preserve"> DNA-S protein, reverse complimentary, etc.</w:t>
             </w:r>
           </w:p>
         </w:tc>
@@ -3671,10 +3704,10 @@
           <w:tcPr>
             <w:tcW w:w="8299" w:type="dxa"/>
             <w:tcBorders>
-              <w:top w:val="single" w:color="auto" w:sz="4" w:space="0"/>
-              <w:left w:val="single" w:color="auto" w:sz="4" w:space="0"/>
-              <w:bottom w:val="single" w:color="auto" w:sz="4" w:space="0"/>
-              <w:right w:val="single" w:color="auto" w:sz="4" w:space="0"/>
+              <w:top w:val="single" w:sz="4" w:space="0" w:color="auto"/>
+              <w:left w:val="single" w:sz="4" w:space="0" w:color="auto"/>
+              <w:bottom w:val="single" w:sz="4" w:space="0" w:color="auto"/>
+              <w:right w:val="single" w:sz="4" w:space="0" w:color="auto"/>
             </w:tcBorders>
             <w:hideMark/>
           </w:tcPr>
@@ -3695,10 +3728,10 @@
           <w:tcPr>
             <w:tcW w:w="8299" w:type="dxa"/>
             <w:tcBorders>
-              <w:top w:val="single" w:color="auto" w:sz="4" w:space="0"/>
-              <w:left w:val="single" w:color="auto" w:sz="4" w:space="0"/>
-              <w:bottom w:val="single" w:color="auto" w:sz="4" w:space="0"/>
-              <w:right w:val="single" w:color="auto" w:sz="4" w:space="0"/>
+              <w:top w:val="single" w:sz="4" w:space="0" w:color="auto"/>
+              <w:left w:val="single" w:sz="4" w:space="0" w:color="auto"/>
+              <w:bottom w:val="single" w:sz="4" w:space="0" w:color="auto"/>
+              <w:right w:val="single" w:sz="4" w:space="0" w:color="auto"/>
             </w:tcBorders>
           </w:tcPr>
           <w:p>
@@ -3713,9 +3746,9 @@
     <w:p/>
     <w:p/>
     <w:sectPr>
-      <w:headerReference w:type="default" r:id="rId8"/>
-      <w:footerReference w:type="default" r:id="rId9"/>
-      <w:pgSz w:w="11909" w:h="16834" w:orient="portrait" w:code="9"/>
+      <w:headerReference w:type="default" r:id="rId7"/>
+      <w:footerReference w:type="default" r:id="rId8"/>
+      <w:pgSz w:w="11909" w:h="16834" w:code="9"/>
       <w:pgMar w:top="1440" w:right="1800" w:bottom="1440" w:left="1800" w:header="708" w:footer="708" w:gutter="0"/>
       <w:cols w:space="708"/>
     </w:sectPr>
@@ -3946,7 +3979,7 @@
         <w:ind w:left="1800" w:hanging="360"/>
       </w:pPr>
       <w:rPr>
-        <w:rFonts w:hint="default" w:ascii="Symbol" w:hAnsi="Symbol"/>
+        <w:rFonts w:ascii="Symbol" w:hAnsi="Symbol" w:hint="default"/>
       </w:rPr>
     </w:lvl>
   </w:abstractNum>
@@ -3966,7 +3999,7 @@
         <w:ind w:left="1440" w:hanging="360"/>
       </w:pPr>
       <w:rPr>
-        <w:rFonts w:hint="default" w:ascii="Symbol" w:hAnsi="Symbol"/>
+        <w:rFonts w:ascii="Symbol" w:hAnsi="Symbol" w:hint="default"/>
       </w:rPr>
     </w:lvl>
   </w:abstractNum>
@@ -3986,7 +4019,7 @@
         <w:ind w:left="1080" w:hanging="360"/>
       </w:pPr>
       <w:rPr>
-        <w:rFonts w:hint="default" w:ascii="Symbol" w:hAnsi="Symbol"/>
+        <w:rFonts w:ascii="Symbol" w:hAnsi="Symbol" w:hint="default"/>
       </w:rPr>
     </w:lvl>
   </w:abstractNum>
@@ -4006,7 +4039,7 @@
         <w:ind w:left="720" w:hanging="360"/>
       </w:pPr>
       <w:rPr>
-        <w:rFonts w:hint="default" w:ascii="Symbol" w:hAnsi="Symbol"/>
+        <w:rFonts w:ascii="Symbol" w:hAnsi="Symbol" w:hint="default"/>
       </w:rPr>
     </w:lvl>
   </w:abstractNum>
@@ -4043,7 +4076,7 @@
         <w:ind w:left="360" w:hanging="360"/>
       </w:pPr>
       <w:rPr>
-        <w:rFonts w:hint="default" w:ascii="Symbol" w:hAnsi="Symbol"/>
+        <w:rFonts w:ascii="Symbol" w:hAnsi="Symbol" w:hint="default"/>
       </w:rPr>
     </w:lvl>
   </w:abstractNum>
@@ -4063,7 +4096,7 @@
         <w:ind w:left="360" w:hanging="360"/>
       </w:pPr>
       <w:rPr>
-        <w:rFonts w:hint="default" w:ascii="Symbol" w:hAnsi="Symbol"/>
+        <w:rFonts w:ascii="Symbol" w:hAnsi="Symbol" w:hint="default"/>
       </w:rPr>
     </w:lvl>
     <w:lvl w:ilvl="1" w:tplc="04090003" w:tentative="1">
@@ -4078,7 +4111,7 @@
         <w:ind w:left="1080" w:hanging="360"/>
       </w:pPr>
       <w:rPr>
-        <w:rFonts w:hint="default" w:ascii="Courier New" w:hAnsi="Courier New"/>
+        <w:rFonts w:ascii="Courier New" w:hAnsi="Courier New" w:hint="default"/>
       </w:rPr>
     </w:lvl>
     <w:lvl w:ilvl="2" w:tplc="04090005" w:tentative="1">
@@ -4093,7 +4126,7 @@
         <w:ind w:left="1800" w:hanging="360"/>
       </w:pPr>
       <w:rPr>
-        <w:rFonts w:hint="default" w:ascii="Wingdings" w:hAnsi="Wingdings"/>
+        <w:rFonts w:ascii="Wingdings" w:hAnsi="Wingdings" w:hint="default"/>
       </w:rPr>
     </w:lvl>
     <w:lvl w:ilvl="3" w:tplc="04090001" w:tentative="1">
@@ -4108,7 +4141,7 @@
         <w:ind w:left="2520" w:hanging="360"/>
       </w:pPr>
       <w:rPr>
-        <w:rFonts w:hint="default" w:ascii="Symbol" w:hAnsi="Symbol"/>
+        <w:rFonts w:ascii="Symbol" w:hAnsi="Symbol" w:hint="default"/>
       </w:rPr>
     </w:lvl>
     <w:lvl w:ilvl="4" w:tplc="04090003" w:tentative="1">
@@ -4123,7 +4156,7 @@
         <w:ind w:left="3240" w:hanging="360"/>
       </w:pPr>
       <w:rPr>
-        <w:rFonts w:hint="default" w:ascii="Courier New" w:hAnsi="Courier New"/>
+        <w:rFonts w:ascii="Courier New" w:hAnsi="Courier New" w:hint="default"/>
       </w:rPr>
     </w:lvl>
     <w:lvl w:ilvl="5" w:tplc="04090005" w:tentative="1">
@@ -4138,7 +4171,7 @@
         <w:ind w:left="3960" w:hanging="360"/>
       </w:pPr>
       <w:rPr>
-        <w:rFonts w:hint="default" w:ascii="Wingdings" w:hAnsi="Wingdings"/>
+        <w:rFonts w:ascii="Wingdings" w:hAnsi="Wingdings" w:hint="default"/>
       </w:rPr>
     </w:lvl>
     <w:lvl w:ilvl="6" w:tplc="04090001" w:tentative="1">
@@ -4153,7 +4186,7 @@
         <w:ind w:left="4680" w:hanging="360"/>
       </w:pPr>
       <w:rPr>
-        <w:rFonts w:hint="default" w:ascii="Symbol" w:hAnsi="Symbol"/>
+        <w:rFonts w:ascii="Symbol" w:hAnsi="Symbol" w:hint="default"/>
       </w:rPr>
     </w:lvl>
     <w:lvl w:ilvl="7" w:tplc="04090003" w:tentative="1">
@@ -4168,7 +4201,7 @@
         <w:ind w:left="5400" w:hanging="360"/>
       </w:pPr>
       <w:rPr>
-        <w:rFonts w:hint="default" w:ascii="Courier New" w:hAnsi="Courier New"/>
+        <w:rFonts w:ascii="Courier New" w:hAnsi="Courier New" w:hint="default"/>
       </w:rPr>
     </w:lvl>
     <w:lvl w:ilvl="8" w:tplc="04090005" w:tentative="1">
@@ -4183,7 +4216,7 @@
         <w:ind w:left="6120" w:hanging="360"/>
       </w:pPr>
       <w:rPr>
-        <w:rFonts w:hint="default" w:ascii="Wingdings" w:hAnsi="Wingdings"/>
+        <w:rFonts w:ascii="Wingdings" w:hAnsi="Wingdings" w:hint="default"/>
       </w:rPr>
     </w:lvl>
   </w:abstractNum>
@@ -4200,7 +4233,7 @@
         <w:ind w:left="720" w:hanging="360"/>
       </w:pPr>
       <w:rPr>
-        <w:rFonts w:hint="default" w:ascii="Symbol" w:hAnsi="Symbol"/>
+        <w:rFonts w:ascii="Symbol" w:hAnsi="Symbol" w:hint="default"/>
       </w:rPr>
     </w:lvl>
     <w:lvl w:ilvl="1" w:tplc="08090003" w:tentative="1">
@@ -4212,7 +4245,7 @@
         <w:ind w:left="1440" w:hanging="360"/>
       </w:pPr>
       <w:rPr>
-        <w:rFonts w:hint="default" w:ascii="Courier New" w:hAnsi="Courier New" w:cs="Courier New"/>
+        <w:rFonts w:ascii="Courier New" w:hAnsi="Courier New" w:cs="Courier New" w:hint="default"/>
       </w:rPr>
     </w:lvl>
     <w:lvl w:ilvl="2" w:tplc="08090005" w:tentative="1">
@@ -4224,7 +4257,7 @@
         <w:ind w:left="2160" w:hanging="360"/>
       </w:pPr>
       <w:rPr>
-        <w:rFonts w:hint="default" w:ascii="Wingdings" w:hAnsi="Wingdings"/>
+        <w:rFonts w:ascii="Wingdings" w:hAnsi="Wingdings" w:hint="default"/>
       </w:rPr>
     </w:lvl>
     <w:lvl w:ilvl="3" w:tplc="08090001" w:tentative="1">
@@ -4236,7 +4269,7 @@
         <w:ind w:left="2880" w:hanging="360"/>
       </w:pPr>
       <w:rPr>
-        <w:rFonts w:hint="default" w:ascii="Symbol" w:hAnsi="Symbol"/>
+        <w:rFonts w:ascii="Symbol" w:hAnsi="Symbol" w:hint="default"/>
       </w:rPr>
     </w:lvl>
     <w:lvl w:ilvl="4" w:tplc="08090003" w:tentative="1">
@@ -4248,7 +4281,7 @@
         <w:ind w:left="3600" w:hanging="360"/>
       </w:pPr>
       <w:rPr>
-        <w:rFonts w:hint="default" w:ascii="Courier New" w:hAnsi="Courier New" w:cs="Courier New"/>
+        <w:rFonts w:ascii="Courier New" w:hAnsi="Courier New" w:cs="Courier New" w:hint="default"/>
       </w:rPr>
     </w:lvl>
     <w:lvl w:ilvl="5" w:tplc="08090005" w:tentative="1">
@@ -4260,7 +4293,7 @@
         <w:ind w:left="4320" w:hanging="360"/>
       </w:pPr>
       <w:rPr>
-        <w:rFonts w:hint="default" w:ascii="Wingdings" w:hAnsi="Wingdings"/>
+        <w:rFonts w:ascii="Wingdings" w:hAnsi="Wingdings" w:hint="default"/>
       </w:rPr>
     </w:lvl>
     <w:lvl w:ilvl="6" w:tplc="08090001" w:tentative="1">
@@ -4272,7 +4305,7 @@
         <w:ind w:left="5040" w:hanging="360"/>
       </w:pPr>
       <w:rPr>
-        <w:rFonts w:hint="default" w:ascii="Symbol" w:hAnsi="Symbol"/>
+        <w:rFonts w:ascii="Symbol" w:hAnsi="Symbol" w:hint="default"/>
       </w:rPr>
     </w:lvl>
     <w:lvl w:ilvl="7" w:tplc="08090003" w:tentative="1">
@@ -4284,7 +4317,7 @@
         <w:ind w:left="5760" w:hanging="360"/>
       </w:pPr>
       <w:rPr>
-        <w:rFonts w:hint="default" w:ascii="Courier New" w:hAnsi="Courier New" w:cs="Courier New"/>
+        <w:rFonts w:ascii="Courier New" w:hAnsi="Courier New" w:cs="Courier New" w:hint="default"/>
       </w:rPr>
     </w:lvl>
     <w:lvl w:ilvl="8" w:tplc="08090005" w:tentative="1">
@@ -4296,7 +4329,7 @@
         <w:ind w:left="6480" w:hanging="360"/>
       </w:pPr>
       <w:rPr>
-        <w:rFonts w:hint="default" w:ascii="Wingdings" w:hAnsi="Wingdings"/>
+        <w:rFonts w:ascii="Wingdings" w:hAnsi="Wingdings" w:hint="default"/>
       </w:rPr>
     </w:lvl>
   </w:abstractNum>
@@ -4312,7 +4345,7 @@
         <w:ind w:left="720" w:hanging="360"/>
       </w:pPr>
       <w:rPr>
-        <w:rFonts w:hint="default" w:ascii="Times New Roman" w:hAnsi="Times New Roman" w:eastAsia="SimSun" w:cs="Times New Roman"/>
+        <w:rFonts w:ascii="Times New Roman" w:eastAsia="SimSun" w:hAnsi="Times New Roman" w:cs="Times New Roman" w:hint="default"/>
       </w:rPr>
     </w:lvl>
     <w:lvl w:ilvl="1" w:tplc="08090003" w:tentative="1">
@@ -4324,7 +4357,7 @@
         <w:ind w:left="1440" w:hanging="360"/>
       </w:pPr>
       <w:rPr>
-        <w:rFonts w:hint="default" w:ascii="Courier New" w:hAnsi="Courier New" w:cs="Courier New"/>
+        <w:rFonts w:ascii="Courier New" w:hAnsi="Courier New" w:cs="Courier New" w:hint="default"/>
       </w:rPr>
     </w:lvl>
     <w:lvl w:ilvl="2" w:tplc="08090005" w:tentative="1">
@@ -4336,7 +4369,7 @@
         <w:ind w:left="2160" w:hanging="360"/>
       </w:pPr>
       <w:rPr>
-        <w:rFonts w:hint="default" w:ascii="Wingdings" w:hAnsi="Wingdings"/>
+        <w:rFonts w:ascii="Wingdings" w:hAnsi="Wingdings" w:hint="default"/>
       </w:rPr>
     </w:lvl>
     <w:lvl w:ilvl="3" w:tplc="08090001" w:tentative="1">
@@ -4348,7 +4381,7 @@
         <w:ind w:left="2880" w:hanging="360"/>
       </w:pPr>
       <w:rPr>
-        <w:rFonts w:hint="default" w:ascii="Symbol" w:hAnsi="Symbol"/>
+        <w:rFonts w:ascii="Symbol" w:hAnsi="Symbol" w:hint="default"/>
       </w:rPr>
     </w:lvl>
     <w:lvl w:ilvl="4" w:tplc="08090003" w:tentative="1">
@@ -4360,7 +4393,7 @@
         <w:ind w:left="3600" w:hanging="360"/>
       </w:pPr>
       <w:rPr>
-        <w:rFonts w:hint="default" w:ascii="Courier New" w:hAnsi="Courier New" w:cs="Courier New"/>
+        <w:rFonts w:ascii="Courier New" w:hAnsi="Courier New" w:cs="Courier New" w:hint="default"/>
       </w:rPr>
     </w:lvl>
     <w:lvl w:ilvl="5" w:tplc="08090005" w:tentative="1">
@@ -4372,7 +4405,7 @@
         <w:ind w:left="4320" w:hanging="360"/>
       </w:pPr>
       <w:rPr>
-        <w:rFonts w:hint="default" w:ascii="Wingdings" w:hAnsi="Wingdings"/>
+        <w:rFonts w:ascii="Wingdings" w:hAnsi="Wingdings" w:hint="default"/>
       </w:rPr>
     </w:lvl>
     <w:lvl w:ilvl="6" w:tplc="08090001" w:tentative="1">
@@ -4384,7 +4417,7 @@
         <w:ind w:left="5040" w:hanging="360"/>
       </w:pPr>
       <w:rPr>
-        <w:rFonts w:hint="default" w:ascii="Symbol" w:hAnsi="Symbol"/>
+        <w:rFonts w:ascii="Symbol" w:hAnsi="Symbol" w:hint="default"/>
       </w:rPr>
     </w:lvl>
     <w:lvl w:ilvl="7" w:tplc="08090003" w:tentative="1">
@@ -4396,7 +4429,7 @@
         <w:ind w:left="5760" w:hanging="360"/>
       </w:pPr>
       <w:rPr>
-        <w:rFonts w:hint="default" w:ascii="Courier New" w:hAnsi="Courier New" w:cs="Courier New"/>
+        <w:rFonts w:ascii="Courier New" w:hAnsi="Courier New" w:cs="Courier New" w:hint="default"/>
       </w:rPr>
     </w:lvl>
     <w:lvl w:ilvl="8" w:tplc="08090005" w:tentative="1">
@@ -4408,7 +4441,7 @@
         <w:ind w:left="6480" w:hanging="360"/>
       </w:pPr>
       <w:rPr>
-        <w:rFonts w:hint="default" w:ascii="Wingdings" w:hAnsi="Wingdings"/>
+        <w:rFonts w:ascii="Wingdings" w:hAnsi="Wingdings" w:hint="default"/>
       </w:rPr>
     </w:lvl>
   </w:abstractNum>
@@ -4428,7 +4461,7 @@
         <w:ind w:left="720" w:hanging="360"/>
       </w:pPr>
       <w:rPr>
-        <w:rFonts w:hint="default" w:ascii="Symbol" w:hAnsi="Symbol"/>
+        <w:rFonts w:ascii="Symbol" w:hAnsi="Symbol" w:hint="default"/>
       </w:rPr>
     </w:lvl>
     <w:lvl w:ilvl="1" w:tplc="04090003" w:tentative="1">
@@ -4443,7 +4476,7 @@
         <w:ind w:left="1440" w:hanging="360"/>
       </w:pPr>
       <w:rPr>
-        <w:rFonts w:hint="default" w:ascii="Courier New" w:hAnsi="Courier New" w:cs="Courier New"/>
+        <w:rFonts w:ascii="Courier New" w:hAnsi="Courier New" w:cs="Courier New" w:hint="default"/>
       </w:rPr>
     </w:lvl>
     <w:lvl w:ilvl="2" w:tplc="04090005" w:tentative="1">
@@ -4458,7 +4491,7 @@
         <w:ind w:left="2160" w:hanging="360"/>
       </w:pPr>
       <w:rPr>
-        <w:rFonts w:hint="default" w:ascii="Wingdings" w:hAnsi="Wingdings"/>
+        <w:rFonts w:ascii="Wingdings" w:hAnsi="Wingdings" w:hint="default"/>
       </w:rPr>
     </w:lvl>
     <w:lvl w:ilvl="3" w:tplc="04090001" w:tentative="1">
@@ -4473,7 +4506,7 @@
         <w:ind w:left="2880" w:hanging="360"/>
       </w:pPr>
       <w:rPr>
-        <w:rFonts w:hint="default" w:ascii="Symbol" w:hAnsi="Symbol"/>
+        <w:rFonts w:ascii="Symbol" w:hAnsi="Symbol" w:hint="default"/>
       </w:rPr>
     </w:lvl>
     <w:lvl w:ilvl="4" w:tplc="04090003" w:tentative="1">
@@ -4488,7 +4521,7 @@
         <w:ind w:left="3600" w:hanging="360"/>
       </w:pPr>
       <w:rPr>
-        <w:rFonts w:hint="default" w:ascii="Courier New" w:hAnsi="Courier New" w:cs="Courier New"/>
+        <w:rFonts w:ascii="Courier New" w:hAnsi="Courier New" w:cs="Courier New" w:hint="default"/>
       </w:rPr>
     </w:lvl>
     <w:lvl w:ilvl="5" w:tplc="04090005" w:tentative="1">
@@ -4503,7 +4536,7 @@
         <w:ind w:left="4320" w:hanging="360"/>
       </w:pPr>
       <w:rPr>
-        <w:rFonts w:hint="default" w:ascii="Wingdings" w:hAnsi="Wingdings"/>
+        <w:rFonts w:ascii="Wingdings" w:hAnsi="Wingdings" w:hint="default"/>
       </w:rPr>
     </w:lvl>
     <w:lvl w:ilvl="6" w:tplc="04090001" w:tentative="1">
@@ -4518,7 +4551,7 @@
         <w:ind w:left="5040" w:hanging="360"/>
       </w:pPr>
       <w:rPr>
-        <w:rFonts w:hint="default" w:ascii="Symbol" w:hAnsi="Symbol"/>
+        <w:rFonts w:ascii="Symbol" w:hAnsi="Symbol" w:hint="default"/>
       </w:rPr>
     </w:lvl>
     <w:lvl w:ilvl="7" w:tplc="04090003" w:tentative="1">
@@ -4533,7 +4566,7 @@
         <w:ind w:left="5760" w:hanging="360"/>
       </w:pPr>
       <w:rPr>
-        <w:rFonts w:hint="default" w:ascii="Courier New" w:hAnsi="Courier New" w:cs="Courier New"/>
+        <w:rFonts w:ascii="Courier New" w:hAnsi="Courier New" w:cs="Courier New" w:hint="default"/>
       </w:rPr>
     </w:lvl>
     <w:lvl w:ilvl="8" w:tplc="04090005" w:tentative="1">
@@ -4548,7 +4581,7 @@
         <w:ind w:left="6480" w:hanging="360"/>
       </w:pPr>
       <w:rPr>
-        <w:rFonts w:hint="default" w:ascii="Wingdings" w:hAnsi="Wingdings"/>
+        <w:rFonts w:ascii="Wingdings" w:hAnsi="Wingdings" w:hint="default"/>
       </w:rPr>
     </w:lvl>
   </w:abstractNum>
@@ -4568,7 +4601,7 @@
         <w:ind w:left="720" w:hanging="360"/>
       </w:pPr>
       <w:rPr>
-        <w:rFonts w:hint="default" w:ascii="Symbol" w:hAnsi="Symbol"/>
+        <w:rFonts w:ascii="Symbol" w:hAnsi="Symbol" w:hint="default"/>
       </w:rPr>
     </w:lvl>
     <w:lvl w:ilvl="1" w:tplc="04090003">
@@ -4583,7 +4616,7 @@
         <w:ind w:left="1440" w:hanging="360"/>
       </w:pPr>
       <w:rPr>
-        <w:rFonts w:hint="default" w:ascii="Courier New" w:hAnsi="Courier New" w:cs="Courier New"/>
+        <w:rFonts w:ascii="Courier New" w:hAnsi="Courier New" w:cs="Courier New" w:hint="default"/>
       </w:rPr>
     </w:lvl>
     <w:lvl w:ilvl="2" w:tplc="04090005" w:tentative="1">
@@ -4598,7 +4631,7 @@
         <w:ind w:left="2160" w:hanging="360"/>
       </w:pPr>
       <w:rPr>
-        <w:rFonts w:hint="default" w:ascii="Wingdings" w:hAnsi="Wingdings"/>
+        <w:rFonts w:ascii="Wingdings" w:hAnsi="Wingdings" w:hint="default"/>
       </w:rPr>
     </w:lvl>
     <w:lvl w:ilvl="3" w:tplc="04090001" w:tentative="1">
@@ -4613,7 +4646,7 @@
         <w:ind w:left="2880" w:hanging="360"/>
       </w:pPr>
       <w:rPr>
-        <w:rFonts w:hint="default" w:ascii="Symbol" w:hAnsi="Symbol"/>
+        <w:rFonts w:ascii="Symbol" w:hAnsi="Symbol" w:hint="default"/>
       </w:rPr>
     </w:lvl>
     <w:lvl w:ilvl="4" w:tplc="04090003" w:tentative="1">
@@ -4628,7 +4661,7 @@
         <w:ind w:left="3600" w:hanging="360"/>
       </w:pPr>
       <w:rPr>
-        <w:rFonts w:hint="default" w:ascii="Courier New" w:hAnsi="Courier New" w:cs="Courier New"/>
+        <w:rFonts w:ascii="Courier New" w:hAnsi="Courier New" w:cs="Courier New" w:hint="default"/>
       </w:rPr>
     </w:lvl>
     <w:lvl w:ilvl="5" w:tplc="04090005" w:tentative="1">
@@ -4643,7 +4676,7 @@
         <w:ind w:left="4320" w:hanging="360"/>
       </w:pPr>
       <w:rPr>
-        <w:rFonts w:hint="default" w:ascii="Wingdings" w:hAnsi="Wingdings"/>
+        <w:rFonts w:ascii="Wingdings" w:hAnsi="Wingdings" w:hint="default"/>
       </w:rPr>
     </w:lvl>
     <w:lvl w:ilvl="6" w:tplc="04090001" w:tentative="1">
@@ -4658,7 +4691,7 @@
         <w:ind w:left="5040" w:hanging="360"/>
       </w:pPr>
       <w:rPr>
-        <w:rFonts w:hint="default" w:ascii="Symbol" w:hAnsi="Symbol"/>
+        <w:rFonts w:ascii="Symbol" w:hAnsi="Symbol" w:hint="default"/>
       </w:rPr>
     </w:lvl>
     <w:lvl w:ilvl="7" w:tplc="04090003" w:tentative="1">
@@ -4673,7 +4706,7 @@
         <w:ind w:left="5760" w:hanging="360"/>
       </w:pPr>
       <w:rPr>
-        <w:rFonts w:hint="default" w:ascii="Courier New" w:hAnsi="Courier New" w:cs="Courier New"/>
+        <w:rFonts w:ascii="Courier New" w:hAnsi="Courier New" w:cs="Courier New" w:hint="default"/>
       </w:rPr>
     </w:lvl>
     <w:lvl w:ilvl="8" w:tplc="04090005" w:tentative="1">
@@ -4688,7 +4721,7 @@
         <w:ind w:left="6480" w:hanging="360"/>
       </w:pPr>
       <w:rPr>
-        <w:rFonts w:hint="default" w:ascii="Wingdings" w:hAnsi="Wingdings"/>
+        <w:rFonts w:ascii="Wingdings" w:hAnsi="Wingdings" w:hint="default"/>
       </w:rPr>
     </w:lvl>
   </w:abstractNum>
@@ -4708,7 +4741,7 @@
         <w:ind w:left="360" w:hanging="360"/>
       </w:pPr>
       <w:rPr>
-        <w:rFonts w:hint="default" w:ascii="Symbol" w:hAnsi="Symbol"/>
+        <w:rFonts w:ascii="Symbol" w:hAnsi="Symbol" w:hint="default"/>
       </w:rPr>
     </w:lvl>
   </w:abstractNum>
@@ -4725,7 +4758,7 @@
         <w:ind w:left="360" w:hanging="360"/>
       </w:pPr>
       <w:rPr>
-        <w:rFonts w:hint="default" w:ascii="Symbol" w:hAnsi="Symbol"/>
+        <w:rFonts w:ascii="Symbol" w:hAnsi="Symbol" w:hint="default"/>
       </w:rPr>
     </w:lvl>
     <w:lvl w:ilvl="1" w:tplc="08090003" w:tentative="1">
@@ -4737,7 +4770,7 @@
         <w:ind w:left="1080" w:hanging="360"/>
       </w:pPr>
       <w:rPr>
-        <w:rFonts w:hint="default" w:ascii="Courier New" w:hAnsi="Courier New" w:cs="Courier New"/>
+        <w:rFonts w:ascii="Courier New" w:hAnsi="Courier New" w:cs="Courier New" w:hint="default"/>
       </w:rPr>
     </w:lvl>
     <w:lvl w:ilvl="2" w:tplc="08090005" w:tentative="1">
@@ -4749,7 +4782,7 @@
         <w:ind w:left="1800" w:hanging="360"/>
       </w:pPr>
       <w:rPr>
-        <w:rFonts w:hint="default" w:ascii="Wingdings" w:hAnsi="Wingdings"/>
+        <w:rFonts w:ascii="Wingdings" w:hAnsi="Wingdings" w:hint="default"/>
       </w:rPr>
     </w:lvl>
     <w:lvl w:ilvl="3" w:tplc="08090001" w:tentative="1">
@@ -4761,7 +4794,7 @@
         <w:ind w:left="2520" w:hanging="360"/>
       </w:pPr>
       <w:rPr>
-        <w:rFonts w:hint="default" w:ascii="Symbol" w:hAnsi="Symbol"/>
+        <w:rFonts w:ascii="Symbol" w:hAnsi="Symbol" w:hint="default"/>
       </w:rPr>
     </w:lvl>
     <w:lvl w:ilvl="4" w:tplc="08090003" w:tentative="1">
@@ -4773,7 +4806,7 @@
         <w:ind w:left="3240" w:hanging="360"/>
       </w:pPr>
       <w:rPr>
-        <w:rFonts w:hint="default" w:ascii="Courier New" w:hAnsi="Courier New" w:cs="Courier New"/>
+        <w:rFonts w:ascii="Courier New" w:hAnsi="Courier New" w:cs="Courier New" w:hint="default"/>
       </w:rPr>
     </w:lvl>
     <w:lvl w:ilvl="5" w:tplc="08090005" w:tentative="1">
@@ -4785,7 +4818,7 @@
         <w:ind w:left="3960" w:hanging="360"/>
       </w:pPr>
       <w:rPr>
-        <w:rFonts w:hint="default" w:ascii="Wingdings" w:hAnsi="Wingdings"/>
+        <w:rFonts w:ascii="Wingdings" w:hAnsi="Wingdings" w:hint="default"/>
       </w:rPr>
     </w:lvl>
     <w:lvl w:ilvl="6" w:tplc="08090001" w:tentative="1">
@@ -4797,7 +4830,7 @@
         <w:ind w:left="4680" w:hanging="360"/>
       </w:pPr>
       <w:rPr>
-        <w:rFonts w:hint="default" w:ascii="Symbol" w:hAnsi="Symbol"/>
+        <w:rFonts w:ascii="Symbol" w:hAnsi="Symbol" w:hint="default"/>
       </w:rPr>
     </w:lvl>
     <w:lvl w:ilvl="7" w:tplc="08090003" w:tentative="1">
@@ -4809,7 +4842,7 @@
         <w:ind w:left="5400" w:hanging="360"/>
       </w:pPr>
       <w:rPr>
-        <w:rFonts w:hint="default" w:ascii="Courier New" w:hAnsi="Courier New" w:cs="Courier New"/>
+        <w:rFonts w:ascii="Courier New" w:hAnsi="Courier New" w:cs="Courier New" w:hint="default"/>
       </w:rPr>
     </w:lvl>
     <w:lvl w:ilvl="8" w:tplc="08090005" w:tentative="1">
@@ -4821,7 +4854,7 @@
         <w:ind w:left="6120" w:hanging="360"/>
       </w:pPr>
       <w:rPr>
-        <w:rFonts w:hint="default" w:ascii="Wingdings" w:hAnsi="Wingdings"/>
+        <w:rFonts w:ascii="Wingdings" w:hAnsi="Wingdings" w:hint="default"/>
       </w:rPr>
     </w:lvl>
   </w:abstractNum>
@@ -4927,7 +4960,7 @@
         <w:ind w:left="360" w:hanging="360"/>
       </w:pPr>
       <w:rPr>
-        <w:rFonts w:hint="default" w:ascii="Symbol" w:hAnsi="Symbol"/>
+        <w:rFonts w:ascii="Symbol" w:hAnsi="Symbol" w:hint="default"/>
       </w:rPr>
     </w:lvl>
     <w:lvl w:ilvl="1" w:tplc="08090003">
@@ -4939,7 +4972,7 @@
         <w:ind w:left="1080" w:hanging="360"/>
       </w:pPr>
       <w:rPr>
-        <w:rFonts w:hint="default" w:ascii="Courier New" w:hAnsi="Courier New" w:cs="Courier New"/>
+        <w:rFonts w:ascii="Courier New" w:hAnsi="Courier New" w:cs="Courier New" w:hint="default"/>
       </w:rPr>
     </w:lvl>
     <w:lvl w:ilvl="2" w:tplc="08090005" w:tentative="1">
@@ -4951,7 +4984,7 @@
         <w:ind w:left="1800" w:hanging="360"/>
       </w:pPr>
       <w:rPr>
-        <w:rFonts w:hint="default" w:ascii="Wingdings" w:hAnsi="Wingdings"/>
+        <w:rFonts w:ascii="Wingdings" w:hAnsi="Wingdings" w:hint="default"/>
       </w:rPr>
     </w:lvl>
     <w:lvl w:ilvl="3" w:tplc="08090001" w:tentative="1">
@@ -4963,7 +4996,7 @@
         <w:ind w:left="2520" w:hanging="360"/>
       </w:pPr>
       <w:rPr>
-        <w:rFonts w:hint="default" w:ascii="Symbol" w:hAnsi="Symbol"/>
+        <w:rFonts w:ascii="Symbol" w:hAnsi="Symbol" w:hint="default"/>
       </w:rPr>
     </w:lvl>
     <w:lvl w:ilvl="4" w:tplc="08090003" w:tentative="1">
@@ -4975,7 +5008,7 @@
         <w:ind w:left="3240" w:hanging="360"/>
       </w:pPr>
       <w:rPr>
-        <w:rFonts w:hint="default" w:ascii="Courier New" w:hAnsi="Courier New" w:cs="Courier New"/>
+        <w:rFonts w:ascii="Courier New" w:hAnsi="Courier New" w:cs="Courier New" w:hint="default"/>
       </w:rPr>
     </w:lvl>
     <w:lvl w:ilvl="5" w:tplc="08090005" w:tentative="1">
@@ -4987,7 +5020,7 @@
         <w:ind w:left="3960" w:hanging="360"/>
       </w:pPr>
       <w:rPr>
-        <w:rFonts w:hint="default" w:ascii="Wingdings" w:hAnsi="Wingdings"/>
+        <w:rFonts w:ascii="Wingdings" w:hAnsi="Wingdings" w:hint="default"/>
       </w:rPr>
     </w:lvl>
     <w:lvl w:ilvl="6" w:tplc="08090001" w:tentative="1">
@@ -4999,7 +5032,7 @@
         <w:ind w:left="4680" w:hanging="360"/>
       </w:pPr>
       <w:rPr>
-        <w:rFonts w:hint="default" w:ascii="Symbol" w:hAnsi="Symbol"/>
+        <w:rFonts w:ascii="Symbol" w:hAnsi="Symbol" w:hint="default"/>
       </w:rPr>
     </w:lvl>
     <w:lvl w:ilvl="7" w:tplc="08090003" w:tentative="1">
@@ -5011,7 +5044,7 @@
         <w:ind w:left="5400" w:hanging="360"/>
       </w:pPr>
       <w:rPr>
-        <w:rFonts w:hint="default" w:ascii="Courier New" w:hAnsi="Courier New" w:cs="Courier New"/>
+        <w:rFonts w:ascii="Courier New" w:hAnsi="Courier New" w:cs="Courier New" w:hint="default"/>
       </w:rPr>
     </w:lvl>
     <w:lvl w:ilvl="8" w:tplc="08090005" w:tentative="1">
@@ -5023,7 +5056,7 @@
         <w:ind w:left="6120" w:hanging="360"/>
       </w:pPr>
       <w:rPr>
-        <w:rFonts w:hint="default" w:ascii="Wingdings" w:hAnsi="Wingdings"/>
+        <w:rFonts w:ascii="Wingdings" w:hAnsi="Wingdings" w:hint="default"/>
       </w:rPr>
     </w:lvl>
   </w:abstractNum>
@@ -5184,7 +5217,7 @@
   <w:docDefaults>
     <w:rPrDefault>
       <w:rPr>
-        <w:rFonts w:ascii="Times New Roman" w:hAnsi="Times New Roman" w:eastAsia="SimSun" w:cs="Times New Roman"/>
+        <w:rFonts w:ascii="Times New Roman" w:eastAsia="SimSun" w:hAnsi="Times New Roman" w:cs="Times New Roman"/>
         <w:lang w:val="en-GB" w:eastAsia="en-GB" w:bidi="ar-SA"/>
       </w:rPr>
     </w:rPrDefault>
@@ -5340,7 +5373,7 @@
     <w:lsdException w:name="Table Web 3" w:semiHidden="1" w:unhideWhenUsed="1"/>
     <w:lsdException w:name="Balloon Text" w:semiHidden="1" w:unhideWhenUsed="1"/>
     <w:lsdException w:name="Table Theme" w:semiHidden="1" w:unhideWhenUsed="1"/>
-    <w:lsdException w:name="Placeholder Text" w:uiPriority="99" w:semiHidden="1"/>
+    <w:lsdException w:name="Placeholder Text" w:semiHidden="1" w:uiPriority="99"/>
     <w:lsdException w:name="No Spacing" w:uiPriority="1" w:qFormat="1"/>
     <w:lsdException w:name="Light Shading" w:uiPriority="60"/>
     <w:lsdException w:name="Light List" w:uiPriority="61"/>
@@ -5362,7 +5395,7 @@
     <w:lsdException w:name="Medium Shading 1 Accent 1" w:uiPriority="63"/>
     <w:lsdException w:name="Medium Shading 2 Accent 1" w:uiPriority="64"/>
     <w:lsdException w:name="Medium List 1 Accent 1" w:uiPriority="65"/>
-    <w:lsdException w:name="Revision" w:uiPriority="99" w:semiHidden="1"/>
+    <w:lsdException w:name="Revision" w:semiHidden="1" w:uiPriority="99"/>
     <w:lsdException w:name="List Paragraph" w:uiPriority="34" w:qFormat="1"/>
     <w:lsdException w:name="Quote" w:uiPriority="29" w:qFormat="1"/>
     <w:lsdException w:name="Intense Quote" w:uiPriority="30" w:qFormat="1"/>
@@ -5449,8 +5482,8 @@
     <w:lsdException w:name="Subtle Reference" w:uiPriority="31" w:qFormat="1"/>
     <w:lsdException w:name="Intense Reference" w:uiPriority="32" w:qFormat="1"/>
     <w:lsdException w:name="Book Title" w:uiPriority="33" w:qFormat="1"/>
-    <w:lsdException w:name="Bibliography" w:uiPriority="37" w:semiHidden="1" w:unhideWhenUsed="1"/>
-    <w:lsdException w:name="TOC Heading" w:uiPriority="39" w:semiHidden="1" w:unhideWhenUsed="1" w:qFormat="1"/>
+    <w:lsdException w:name="Bibliography" w:semiHidden="1" w:uiPriority="37" w:unhideWhenUsed="1"/>
+    <w:lsdException w:name="TOC Heading" w:semiHidden="1" w:uiPriority="39" w:unhideWhenUsed="1" w:qFormat="1"/>
     <w:lsdException w:name="Plain Table 1" w:uiPriority="41"/>
     <w:lsdException w:name="Plain Table 2" w:uiPriority="42"/>
     <w:lsdException w:name="Plain Table 3" w:uiPriority="43"/>
@@ -5555,13 +5588,13 @@
     <w:lsdException w:name="List Table 5 Dark Accent 6" w:uiPriority="50"/>
     <w:lsdException w:name="List Table 6 Colorful Accent 6" w:uiPriority="51"/>
     <w:lsdException w:name="List Table 7 Colorful Accent 6" w:uiPriority="52"/>
-    <w:lsdException w:name="Mention" w:uiPriority="99" w:semiHidden="1" w:unhideWhenUsed="1"/>
-    <w:lsdException w:name="Smart Hyperlink" w:uiPriority="99" w:semiHidden="1" w:unhideWhenUsed="1"/>
-    <w:lsdException w:name="Hashtag" w:uiPriority="99" w:semiHidden="1" w:unhideWhenUsed="1"/>
-    <w:lsdException w:name="Unresolved Mention" w:uiPriority="99" w:semiHidden="1" w:unhideWhenUsed="1"/>
-    <w:lsdException w:name="Smart Link" w:uiPriority="99" w:semiHidden="1" w:unhideWhenUsed="1"/>
+    <w:lsdException w:name="Mention" w:semiHidden="1" w:uiPriority="99" w:unhideWhenUsed="1"/>
+    <w:lsdException w:name="Smart Hyperlink" w:semiHidden="1" w:uiPriority="99" w:unhideWhenUsed="1"/>
+    <w:lsdException w:name="Hashtag" w:semiHidden="1" w:uiPriority="99" w:unhideWhenUsed="1"/>
+    <w:lsdException w:name="Unresolved Mention" w:semiHidden="1" w:uiPriority="99" w:unhideWhenUsed="1"/>
+    <w:lsdException w:name="Smart Link" w:semiHidden="1" w:uiPriority="99" w:unhideWhenUsed="1"/>
   </w:latentStyles>
-  <w:style w:type="paragraph" w:styleId="Normal" w:default="1">
+  <w:style w:type="paragraph" w:default="1" w:styleId="Normal">
     <w:name w:val="Normal"/>
     <w:qFormat/>
     <w:rPr>
@@ -5645,13 +5678,13 @@
       <w:i/>
     </w:rPr>
   </w:style>
-  <w:style w:type="character" w:styleId="DefaultParagraphFont" w:default="1">
+  <w:style w:type="character" w:default="1" w:styleId="DefaultParagraphFont">
     <w:name w:val="Default Paragraph Font"/>
     <w:uiPriority w:val="1"/>
     <w:semiHidden/>
     <w:unhideWhenUsed/>
   </w:style>
-  <w:style w:type="table" w:styleId="TableNormal" w:default="1">
+  <w:style w:type="table" w:default="1" w:styleId="TableNormal">
     <w:name w:val="Normal Table"/>
     <w:uiPriority w:val="99"/>
     <w:semiHidden/>
@@ -5666,13 +5699,13 @@
       </w:tblCellMar>
     </w:tblPr>
   </w:style>
-  <w:style w:type="numbering" w:styleId="NoList" w:default="1">
+  <w:style w:type="numbering" w:default="1" w:styleId="NoList">
     <w:name w:val="No List"/>
     <w:uiPriority w:val="99"/>
     <w:semiHidden/>
     <w:unhideWhenUsed/>
   </w:style>
-  <w:style w:type="character" w:styleId="courier" w:customStyle="1">
+  <w:style w:type="character" w:customStyle="1" w:styleId="courier">
     <w:name w:val="courier"/>
     <w:rPr>
       <w:rFonts w:ascii="Courier New" w:hAnsi="Courier New"/>
@@ -5762,12 +5795,12 @@
     <w:rsid w:val="00E97A34"/>
     <w:tblPr>
       <w:tblBorders>
-        <w:top w:val="single" w:color="auto" w:sz="4" w:space="0"/>
-        <w:left w:val="single" w:color="auto" w:sz="4" w:space="0"/>
-        <w:bottom w:val="single" w:color="auto" w:sz="4" w:space="0"/>
-        <w:right w:val="single" w:color="auto" w:sz="4" w:space="0"/>
-        <w:insideH w:val="single" w:color="auto" w:sz="4" w:space="0"/>
-        <w:insideV w:val="single" w:color="auto" w:sz="4" w:space="0"/>
+        <w:top w:val="single" w:sz="4" w:space="0" w:color="auto"/>
+        <w:left w:val="single" w:sz="4" w:space="0" w:color="auto"/>
+        <w:bottom w:val="single" w:sz="4" w:space="0" w:color="auto"/>
+        <w:right w:val="single" w:sz="4" w:space="0" w:color="auto"/>
+        <w:insideH w:val="single" w:sz="4" w:space="0" w:color="auto"/>
+        <w:insideV w:val="single" w:sz="4" w:space="0" w:color="auto"/>
       </w:tblBorders>
     </w:tblPr>
   </w:style>
@@ -6092,16 +6125,4 @@
   <a:objectDefaults/>
   <a:extraClrSchemeLst/>
 </a:theme>
-</file>
-
-<file path=customXml/item1.xml><?xml version="1.0" encoding="utf-8"?>
-<b:Sources xmlns:b="http://schemas.openxmlformats.org/officeDocument/2006/bibliography" xmlns="http://schemas.openxmlformats.org/officeDocument/2006/bibliography" SelectedStyle="\APA.XSL" StyleName="APA"/>
-</file>
-
-<file path=customXml/itemProps1.xml><?xml version="1.0" encoding="utf-8"?>
-<ds:datastoreItem xmlns:ds="http://schemas.openxmlformats.org/officeDocument/2006/customXml" ds:itemID="{74A202E2-0D09-48B3-9D9B-4B07A3332C6C}">
-  <ds:schemaRefs>
-    <ds:schemaRef ds:uri="http://schemas.openxmlformats.org/officeDocument/2006/bibliography"/>
-  </ds:schemaRefs>
-</ds:datastoreItem>
 </file>
</xml_diff>